<commit_message>
set engine.py property G to relistic value, and scale start velos in main.py
</commit_message>
<xml_diff>
--- a/notes/res.docx
+++ b/notes/res.docx
@@ -56,7 +56,7 @@
                         <pic:cNvPicPr/>
                       </pic:nvPicPr>
                       <pic:blipFill>
-                        <a:blip r:embed="rId4" cstate="print">
+                        <a:blip r:embed="rId5" cstate="print">
                           <a:duotone>
                             <a:schemeClr val="accent1">
                               <a:shade val="45000"/>
@@ -144,7 +144,7 @@
                   <w:sz w:val="72"/>
                   <w:szCs w:val="72"/>
                 </w:rPr>
-                <w:t>title</w:t>
+                <w:t>Solar simulator</w:t>
               </w:r>
             </w:p>
           </w:sdtContent>
@@ -291,6 +291,7 @@
                                         <w:color w:val="156082" w:themeColor="accent1"/>
                                         <w:sz w:val="28"/>
                                         <w:szCs w:val="28"/>
+                                        <w:lang w:val="da-DK"/>
                                       </w:rPr>
                                     </w:pPr>
                                     <w:r>
@@ -300,7 +301,7 @@
                                         <w:sz w:val="28"/>
                                         <w:szCs w:val="28"/>
                                       </w:rPr>
-                                      <w:t>[Date]</w:t>
+                                      <w:t xml:space="preserve">     </w:t>
                                     </w:r>
                                   </w:p>
                                 </w:sdtContent>
@@ -311,6 +312,7 @@
                                   <w:jc w:val="center"/>
                                   <w:rPr>
                                     <w:color w:val="156082" w:themeColor="accent1"/>
+                                    <w:lang w:val="da-DK"/>
                                   </w:rPr>
                                 </w:pPr>
                                 <w:sdt>
@@ -318,6 +320,7 @@
                                     <w:rPr>
                                       <w:caps/>
                                       <w:color w:val="156082" w:themeColor="accent1"/>
+                                      <w:lang w:val="da-DK"/>
                                     </w:rPr>
                                     <w:alias w:val="Company"/>
                                     <w:tag w:val=""/>
@@ -330,8 +333,9 @@
                                       <w:rPr>
                                         <w:caps/>
                                         <w:color w:val="156082" w:themeColor="accent1"/>
+                                        <w:lang w:val="da-DK"/>
                                       </w:rPr>
-                                      <w:t>Svendborg HTX</w:t>
+                                      <w:t>Lucas lauritsen</w:t>
                                     </w:r>
                                   </w:sdtContent>
                                 </w:sdt>
@@ -342,17 +346,18 @@
                                   <w:jc w:val="center"/>
                                   <w:rPr>
                                     <w:color w:val="156082" w:themeColor="accent1"/>
+                                    <w:lang w:val="da-DK"/>
                                   </w:rPr>
                                 </w:pPr>
                                 <w:sdt>
                                   <w:sdtPr>
                                     <w:rPr>
                                       <w:color w:val="156082" w:themeColor="accent1"/>
+                                      <w:lang w:val="da-DK"/>
                                     </w:rPr>
                                     <w:alias w:val="Address"/>
                                     <w:tag w:val=""/>
                                     <w:id w:val="-726379553"/>
-                                    <w:showingPlcHdr/>
                                     <w:dataBinding w:prefixMappings="xmlns:ns0='http://schemas.microsoft.com/office/2006/coverPageProps' " w:xpath="/ns0:CoverPageProperties[1]/ns0:CompanyAddress[1]" w:storeItemID="{55AF091B-3C7A-41E3-B477-F2FDAA23CFDA}"/>
                                     <w:text/>
                                   </w:sdtPr>
@@ -360,8 +365,16 @@
                                     <w:r>
                                       <w:rPr>
                                         <w:color w:val="156082" w:themeColor="accent1"/>
+                                        <w:lang w:val="da-DK"/>
                                       </w:rPr>
-                                      <w:t>[Company address]</w:t>
+                                      <w:t>SESG HTX S</w:t>
+                                    </w:r>
+                                    <w:r>
+                                      <w:rPr>
+                                        <w:color w:val="156082" w:themeColor="accent1"/>
+                                        <w:lang w:val="da-DK"/>
+                                      </w:rPr>
+                                      <w:t>vendborg</w:t>
                                     </w:r>
                                   </w:sdtContent>
                                 </w:sdt>
@@ -426,6 +439,7 @@
                                   <w:color w:val="156082" w:themeColor="accent1"/>
                                   <w:sz w:val="28"/>
                                   <w:szCs w:val="28"/>
+                                  <w:lang w:val="da-DK"/>
                                 </w:rPr>
                               </w:pPr>
                               <w:r>
@@ -435,7 +449,7 @@
                                   <w:sz w:val="28"/>
                                   <w:szCs w:val="28"/>
                                 </w:rPr>
-                                <w:t>[Date]</w:t>
+                                <w:t xml:space="preserve">     </w:t>
                               </w:r>
                             </w:p>
                           </w:sdtContent>
@@ -446,6 +460,7 @@
                             <w:jc w:val="center"/>
                             <w:rPr>
                               <w:color w:val="156082" w:themeColor="accent1"/>
+                              <w:lang w:val="da-DK"/>
                             </w:rPr>
                           </w:pPr>
                           <w:sdt>
@@ -453,6 +468,7 @@
                               <w:rPr>
                                 <w:caps/>
                                 <w:color w:val="156082" w:themeColor="accent1"/>
+                                <w:lang w:val="da-DK"/>
                               </w:rPr>
                               <w:alias w:val="Company"/>
                               <w:tag w:val=""/>
@@ -465,8 +481,9 @@
                                 <w:rPr>
                                   <w:caps/>
                                   <w:color w:val="156082" w:themeColor="accent1"/>
+                                  <w:lang w:val="da-DK"/>
                                 </w:rPr>
-                                <w:t>Svendborg HTX</w:t>
+                                <w:t>Lucas lauritsen</w:t>
                               </w:r>
                             </w:sdtContent>
                           </w:sdt>
@@ -477,17 +494,18 @@
                             <w:jc w:val="center"/>
                             <w:rPr>
                               <w:color w:val="156082" w:themeColor="accent1"/>
+                              <w:lang w:val="da-DK"/>
                             </w:rPr>
                           </w:pPr>
                           <w:sdt>
                             <w:sdtPr>
                               <w:rPr>
                                 <w:color w:val="156082" w:themeColor="accent1"/>
+                                <w:lang w:val="da-DK"/>
                               </w:rPr>
                               <w:alias w:val="Address"/>
                               <w:tag w:val=""/>
                               <w:id w:val="-726379553"/>
-                              <w:showingPlcHdr/>
                               <w:dataBinding w:prefixMappings="xmlns:ns0='http://schemas.microsoft.com/office/2006/coverPageProps' " w:xpath="/ns0:CoverPageProperties[1]/ns0:CompanyAddress[1]" w:storeItemID="{55AF091B-3C7A-41E3-B477-F2FDAA23CFDA}"/>
                               <w:text/>
                             </w:sdtPr>
@@ -495,8 +513,16 @@
                               <w:r>
                                 <w:rPr>
                                   <w:color w:val="156082" w:themeColor="accent1"/>
+                                  <w:lang w:val="da-DK"/>
                                 </w:rPr>
-                                <w:t>[Company address]</w:t>
+                                <w:t>SESG HTX S</w:t>
+                              </w:r>
+                              <w:r>
+                                <w:rPr>
+                                  <w:color w:val="156082" w:themeColor="accent1"/>
+                                  <w:lang w:val="da-DK"/>
+                                </w:rPr>
+                                <w:t>vendborg</w:t>
                               </w:r>
                             </w:sdtContent>
                           </w:sdt>
@@ -530,7 +556,7 @@
                         <pic:cNvPicPr/>
                       </pic:nvPicPr>
                       <pic:blipFill>
-                        <a:blip r:embed="rId5" cstate="print">
+                        <a:blip r:embed="rId6" cstate="print">
                           <a:duotone>
                             <a:schemeClr val="accent1">
                               <a:shade val="45000"/>
@@ -646,23 +672,6 @@
         <w:t xml:space="preserve">Programmet skal ud fra start position, masse samt start velocity, simulerer planternes samt stjernernes påvirkning på hindanen </w:t>
       </w:r>
     </w:p>
-    <w:p>
-      <w:pPr>
-        <w:pStyle w:val="Heading1"/>
-      </w:pPr>
-      <w:bookmarkStart w:id="4" w:name="_Toc225235117"/>
-      <w:r>
-        <w:t>Brugergrænseflader</w:t>
-      </w:r>
-      <w:bookmarkEnd w:id="4"/>
-    </w:p>
-    <w:p>
-      <w:r>
-        <w:t>Skitser/prototyper og interaktionsmuligheder</w:t>
-      </w:r>
-    </w:p>
-    <w:p/>
-    <w:p/>
     <w:p>
       <w:pPr>
         <w:pStyle w:val="Heading1"/>
@@ -967,7 +976,7 @@
                     <pic:cNvPicPr/>
                   </pic:nvPicPr>
                   <pic:blipFill>
-                    <a:blip r:embed="rId6"/>
+                    <a:blip r:embed="rId7"/>
                     <a:stretch>
                       <a:fillRect/>
                     </a:stretch>
@@ -1049,7 +1058,6 @@
             <w:rPr>
               <w:rFonts w:ascii="Cambria Math" w:eastAsiaTheme="minorEastAsia" w:hAnsi="Cambria Math"/>
             </w:rPr>
-            <w:lastRenderedPageBreak/>
             <m:t>g=</m:t>
           </m:r>
           <m:f>
@@ -1516,6 +1524,7 @@
             <w:rPr>
               <w:rFonts w:ascii="Cambria Math" w:eastAsiaTheme="minorEastAsia" w:hAnsi="Cambria Math"/>
             </w:rPr>
+            <w:lastRenderedPageBreak/>
             <m:t>r=</m:t>
           </m:r>
           <m:d>
@@ -2315,126 +2324,88 @@
     </w:p>
     <w:p>
       <w:pPr>
-        <w:jc w:val="both"/>
-        <w:rPr>
-          <w:rFonts w:eastAsiaTheme="minorEastAsia"/>
-        </w:rPr>
+        <w:pStyle w:val="Heading1"/>
       </w:pPr>
+      <w:bookmarkStart w:id="4" w:name="_Toc225235118"/>
+      <w:bookmarkStart w:id="5" w:name="_Toc225235120"/>
+      <w:bookmarkStart w:id="6" w:name="_Toc225235119"/>
+      <w:r>
+        <w:t>Pseudokode</w:t>
+      </w:r>
+      <w:bookmarkEnd w:id="6"/>
     </w:p>
     <w:p>
-      <w:pPr>
-        <w:jc w:val="both"/>
-        <w:rPr>
-          <w:rFonts w:eastAsiaTheme="minorEastAsia"/>
-        </w:rPr>
-      </w:pPr>
-    </w:p>
-    <w:p>
-      <w:pPr>
-        <w:jc w:val="both"/>
-        <w:rPr>
-          <w:rFonts w:eastAsiaTheme="minorEastAsia"/>
-        </w:rPr>
-      </w:pPr>
-    </w:p>
-    <w:p>
-      <w:pPr>
-        <w:jc w:val="both"/>
-        <w:rPr>
-          <w:rFonts w:eastAsiaTheme="minorEastAsia"/>
-        </w:rPr>
-      </w:pPr>
-    </w:p>
-    <w:p>
-      <w:pPr>
-        <w:jc w:val="both"/>
-      </w:pPr>
+      <w:r>
+        <w:t>Tekstrepræsentation af udvalgte programdele</w:t>
+      </w:r>
     </w:p>
     <w:p>
       <w:pPr>
         <w:pStyle w:val="Heading1"/>
       </w:pPr>
-      <w:bookmarkStart w:id="5" w:name="_Toc225235118"/>
-      <w:r>
-        <w:t>Rutediagrammer</w:t>
+      <w:r>
+        <w:t>Udvalgt kode</w:t>
       </w:r>
       <w:bookmarkEnd w:id="5"/>
     </w:p>
     <w:p>
       <w:r>
-        <w:t>Visuel repræsentation af udvalgte programdele</w:t>
+        <w:t>Beskrivelse af variabler, objekter, hændelser og lign.</w:t>
       </w:r>
     </w:p>
     <w:p>
       <w:pPr>
         <w:pStyle w:val="Heading1"/>
       </w:pPr>
-      <w:bookmarkStart w:id="6" w:name="_Toc225235119"/>
-      <w:r>
-        <w:t>Pseudokode</w:t>
-      </w:r>
-      <w:bookmarkEnd w:id="6"/>
+      <w:r>
+        <w:t>Rutediagrammer</w:t>
+      </w:r>
+      <w:bookmarkEnd w:id="4"/>
     </w:p>
     <w:p>
       <w:r>
-        <w:t>Tekstrepræsentation af udvalgte programdele</w:t>
+        <w:t>Visuel repræsentation af udvalgte programdele</w:t>
       </w:r>
     </w:p>
     <w:p>
       <w:pPr>
         <w:pStyle w:val="Heading1"/>
       </w:pPr>
-      <w:bookmarkStart w:id="7" w:name="_Toc225235120"/>
-      <w:r>
-        <w:t>Udvalgt kode</w:t>
+      <w:bookmarkStart w:id="7" w:name="_Toc225235121"/>
+      <w:r>
+        <w:t>Test af programmet</w:t>
       </w:r>
       <w:bookmarkEnd w:id="7"/>
     </w:p>
     <w:p>
       <w:r>
-        <w:t>Beskrivelse af variabler, objekter, hændelser og lign.</w:t>
+        <w:t>Dokumentation af programmets afprøvning</w:t>
       </w:r>
     </w:p>
     <w:p>
       <w:pPr>
         <w:pStyle w:val="Heading1"/>
       </w:pPr>
-      <w:bookmarkStart w:id="8" w:name="_Toc225235121"/>
-      <w:r>
-        <w:lastRenderedPageBreak/>
-        <w:t>Test af programmet</w:t>
+      <w:bookmarkStart w:id="8" w:name="_Toc225235122"/>
+      <w:r>
+        <w:t>Konklusion</w:t>
       </w:r>
       <w:bookmarkEnd w:id="8"/>
     </w:p>
     <w:p>
       <w:r>
-        <w:t>Dokumentation af programmets afprøvning</w:t>
+        <w:t>Opfølgning på problemformuleringen og mangler</w:t>
       </w:r>
     </w:p>
     <w:p>
       <w:pPr>
         <w:pStyle w:val="Heading1"/>
       </w:pPr>
-      <w:bookmarkStart w:id="9" w:name="_Toc225235122"/>
-      <w:r>
-        <w:t>Konklusion</w:t>
+      <w:bookmarkStart w:id="9" w:name="_Toc225235123"/>
+      <w:r>
+        <w:t>Bilag</w:t>
       </w:r>
       <w:bookmarkEnd w:id="9"/>
-    </w:p>
-    <w:p>
-      <w:r>
-        <w:t>Opfølgning på problemformuleringen og mangler</w:t>
-      </w:r>
-    </w:p>
-    <w:p>
-      <w:pPr>
-        <w:pStyle w:val="Heading1"/>
-      </w:pPr>
-      <w:bookmarkStart w:id="10" w:name="_Toc225235123"/>
-      <w:r>
-        <w:t>Bilag</w:t>
-      </w:r>
-      <w:bookmarkEnd w:id="10"/>
     </w:p>
     <w:p>
       <w:pPr>
@@ -2442,14 +2413,6 @@
           <w:lang w:val="en-DK"/>
         </w:rPr>
       </w:pPr>
-      <w:proofErr w:type="spellStart"/>
-      <w:r>
-        <w:t>Samtlig</w:t>
-      </w:r>
-      <w:proofErr w:type="spellEnd"/>
-      <w:r>
-        <w:t xml:space="preserve"> kode, problemtræer, data med mere</w:t>
-      </w:r>
     </w:p>
     <w:sectPr>
       <w:pgSz w:w="11906" w:h="16838"/>
@@ -3692,9 +3655,9 @@
     <w:rsid w:val="00036F8A"/>
     <w:rsid w:val="001F5ABE"/>
     <w:rsid w:val="00315E7B"/>
-    <w:rsid w:val="004E1A68"/>
     <w:rsid w:val="00520D27"/>
     <w:rsid w:val="00560E4C"/>
+    <w:rsid w:val="00631C0A"/>
     <w:rsid w:val="008A708E"/>
     <w:rsid w:val="00B50222"/>
     <w:rsid w:val="00C87345"/>
@@ -4375,4 +4338,23 @@
   <a:objectDefaults/>
   <a:extraClrSchemeLst/>
 </a:theme>
+</file>
+
+<file path=customXml/item1.xml><?xml version="1.0" encoding="utf-8"?>
+<CoverPageProperties xmlns="http://schemas.microsoft.com/office/2006/coverPageProps">
+  <PublishDate/>
+  <Abstract/>
+  <CompanyAddress>SESG HTX Svendborg</CompanyAddress>
+  <CompanyPhone/>
+  <CompanyFax/>
+  <CompanyEmail/>
+</CoverPageProperties>
+</file>
+
+<file path=customXml/itemProps1.xml><?xml version="1.0" encoding="utf-8"?>
+<ds:datastoreItem xmlns:ds="http://schemas.openxmlformats.org/officeDocument/2006/customXml" ds:itemID="{55AF091B-3C7A-41E3-B477-F2FDAA23CFDA}">
+  <ds:schemaRefs>
+    <ds:schemaRef ds:uri="http://schemas.microsoft.com/office/2006/coverPageProps"/>
+  </ds:schemaRefs>
+</ds:datastoreItem>
 </file>
</xml_diff>

<commit_message>
removed redundent varible in engine.py
</commit_message>
<xml_diff>
--- a/notes/res.docx
+++ b/notes/res.docx
@@ -6,7 +6,13 @@
     <w:sdt>
       <w:sdtPr>
         <w:rPr>
+          <w:rFonts w:ascii="Times New Roman" w:eastAsiaTheme="minorHAnsi" w:hAnsi="Times New Roman"/>
           <w:color w:val="156082" w:themeColor="accent1"/>
+          <w:kern w:val="2"/>
+          <w:sz w:val="24"/>
+          <w:szCs w:val="24"/>
+          <w:lang w:val="da-DK"/>
+          <w14:ligatures w14:val="standardContextual"/>
         </w:rPr>
         <w:id w:val="-1439669802"/>
         <w:docPartObj>
@@ -16,13 +22,7 @@
       </w:sdtPr>
       <w:sdtEndPr>
         <w:rPr>
-          <w:rFonts w:ascii="Times New Roman" w:eastAsiaTheme="minorHAnsi" w:hAnsi="Times New Roman"/>
           <w:color w:val="auto"/>
-          <w:kern w:val="2"/>
-          <w:sz w:val="24"/>
-          <w:szCs w:val="24"/>
-          <w:lang w:val="da-DK"/>
-          <w14:ligatures w14:val="standardContextual"/>
         </w:rPr>
       </w:sdtEndPr>
       <w:sdtContent>
@@ -776,13 +776,7 @@
         <w:rPr>
           <w:rFonts w:eastAsiaTheme="minorEastAsia"/>
         </w:rPr>
-        <w:t>T</w:t>
-      </w:r>
-      <w:r>
-        <w:rPr>
-          <w:rFonts w:eastAsiaTheme="minorEastAsia"/>
-        </w:rPr>
-        <w:t>yngdeaccelerationen</w:t>
+        <w:t>Tyngdeaccelerationen</w:t>
       </w:r>
       <w:r>
         <w:rPr>
@@ -959,6 +953,7 @@
       <w:r>
         <w:rPr>
           <w:rFonts w:eastAsiaTheme="minorEastAsia"/>
+          <w:noProof/>
         </w:rPr>
         <w:drawing>
           <wp:inline distT="0" distB="0" distL="0" distR="0" wp14:anchorId="304CD51B" wp14:editId="0FA31E2D">
@@ -1022,13 +1017,7 @@
         <w:rPr>
           <w:rFonts w:eastAsiaTheme="minorEastAsia"/>
         </w:rPr>
-        <w:t xml:space="preserve"> være afstanden fra </w:t>
-      </w:r>
-      <w:r>
-        <w:rPr>
-          <w:rFonts w:eastAsiaTheme="minorEastAsia"/>
-        </w:rPr>
-        <w:t xml:space="preserve">jordens kerne til </w:t>
+        <w:t xml:space="preserve"> være afstanden fra jordens kerne til </w:t>
       </w:r>
       <w:r>
         <w:rPr>
@@ -1084,13 +1073,7 @@
                     <w:rPr>
                       <w:rFonts w:ascii="Cambria Math" w:eastAsiaTheme="minorEastAsia" w:hAnsi="Cambria Math"/>
                     </w:rPr>
-                    <m:t>6.6743</m:t>
-                  </m:r>
-                  <m:r>
-                    <w:rPr>
-                      <w:rFonts w:ascii="Cambria Math" w:eastAsiaTheme="minorEastAsia" w:hAnsi="Cambria Math"/>
-                    </w:rPr>
-                    <m:t>·</m:t>
+                    <m:t>6.6743·</m:t>
                   </m:r>
                   <m:sSup>
                     <m:sSupPr>
@@ -1124,19 +1107,7 @@
                 <w:rPr>
                   <w:rFonts w:ascii="Cambria Math" w:eastAsiaTheme="minorEastAsia" w:hAnsi="Cambria Math"/>
                 </w:rPr>
-                <m:t>·</m:t>
-              </m:r>
-              <m:r>
-                <w:rPr>
-                  <w:rFonts w:ascii="Cambria Math" w:eastAsiaTheme="minorEastAsia" w:hAnsi="Cambria Math"/>
-                </w:rPr>
-                <m:t>5,972</m:t>
-              </m:r>
-              <m:r>
-                <w:rPr>
-                  <w:rFonts w:ascii="Cambria Math" w:eastAsiaTheme="minorEastAsia" w:hAnsi="Cambria Math"/>
-                </w:rPr>
-                <m:t>·</m:t>
+                <m:t>·5,972·</m:t>
               </m:r>
               <m:sSup>
                 <m:sSupPr>
@@ -1943,13 +1914,7 @@
                 <w:rPr>
                   <w:rFonts w:ascii="Cambria Math" w:eastAsiaTheme="minorEastAsia" w:hAnsi="Cambria Math"/>
                 </w:rPr>
-                <m:t>G·M</m:t>
-              </m:r>
-              <m:r>
-                <w:rPr>
-                  <w:rFonts w:ascii="Cambria Math" w:eastAsiaTheme="minorEastAsia" w:hAnsi="Cambria Math"/>
-                </w:rPr>
-                <m:t>·m</m:t>
+                <m:t>G·M·m</m:t>
               </m:r>
             </m:num>
             <m:den>
@@ -1967,19 +1932,7 @@
                     <w:rPr>
                       <w:rFonts w:ascii="Cambria Math" w:eastAsiaTheme="minorEastAsia" w:hAnsi="Cambria Math"/>
                     </w:rPr>
-                    <m:t>|</m:t>
-                  </m:r>
-                  <m:r>
-                    <w:rPr>
-                      <w:rFonts w:ascii="Cambria Math" w:eastAsiaTheme="minorEastAsia" w:hAnsi="Cambria Math"/>
-                    </w:rPr>
-                    <m:t>r</m:t>
-                  </m:r>
-                  <m:r>
-                    <w:rPr>
-                      <w:rFonts w:ascii="Cambria Math" w:eastAsiaTheme="minorEastAsia" w:hAnsi="Cambria Math"/>
-                    </w:rPr>
-                    <m:t>|</m:t>
+                    <m:t>|r|</m:t>
                   </m:r>
                 </m:e>
                 <m:sup>
@@ -2067,19 +2020,7 @@
             <w:rPr>
               <w:rFonts w:ascii="Cambria Math" w:eastAsiaTheme="minorEastAsia" w:hAnsi="Cambria Math"/>
             </w:rPr>
-            <m:t>=</m:t>
-          </m:r>
-          <m:r>
-            <w:rPr>
-              <w:rFonts w:ascii="Cambria Math" w:eastAsiaTheme="minorEastAsia" w:hAnsi="Cambria Math"/>
-            </w:rPr>
-            <m:t>G·M·m</m:t>
-          </m:r>
-          <m:r>
-            <w:rPr>
-              <w:rFonts w:ascii="Cambria Math" w:eastAsiaTheme="minorEastAsia" w:hAnsi="Cambria Math"/>
-            </w:rPr>
-            <m:t>·</m:t>
+            <m:t>=G·M·m·</m:t>
           </m:r>
           <m:f>
             <m:fPr>
@@ -2163,13 +2104,7 @@
             <w:rPr>
               <w:rFonts w:ascii="Cambria Math" w:eastAsiaTheme="minorEastAsia" w:hAnsi="Cambria Math"/>
             </w:rPr>
-            <m:t>G·M·m</m:t>
-          </m:r>
-          <m:r>
-            <w:rPr>
-              <w:rFonts w:ascii="Cambria Math" w:eastAsiaTheme="minorEastAsia" w:hAnsi="Cambria Math"/>
-            </w:rPr>
-            <m:t>·</m:t>
+            <m:t>G·M·m·</m:t>
           </m:r>
           <m:f>
             <m:fPr>
@@ -2275,19 +2210,7 @@
                 <w:rPr>
                   <w:rFonts w:ascii="Cambria Math" w:eastAsiaTheme="minorEastAsia" w:hAnsi="Cambria Math"/>
                 </w:rPr>
-                <m:t>G·M·m</m:t>
-              </m:r>
-              <m:r>
-                <w:rPr>
-                  <w:rFonts w:ascii="Cambria Math" w:eastAsiaTheme="minorEastAsia" w:hAnsi="Cambria Math"/>
-                </w:rPr>
-                <m:t>·</m:t>
-              </m:r>
-              <m:r>
-                <w:rPr>
-                  <w:rFonts w:ascii="Cambria Math" w:eastAsiaTheme="minorEastAsia" w:hAnsi="Cambria Math"/>
-                </w:rPr>
-                <m:t>r</m:t>
+                <m:t>G·M·m·r</m:t>
               </m:r>
             </m:num>
             <m:den>
@@ -2326,13 +2249,13 @@
       <w:pPr>
         <w:pStyle w:val="Heading1"/>
       </w:pPr>
-      <w:bookmarkStart w:id="4" w:name="_Toc225235118"/>
+      <w:bookmarkStart w:id="4" w:name="_Toc225235119"/>
       <w:bookmarkStart w:id="5" w:name="_Toc225235120"/>
-      <w:bookmarkStart w:id="6" w:name="_Toc225235119"/>
+      <w:bookmarkStart w:id="6" w:name="_Toc225235118"/>
       <w:r>
         <w:t>Pseudokode</w:t>
       </w:r>
-      <w:bookmarkEnd w:id="6"/>
+      <w:bookmarkEnd w:id="4"/>
     </w:p>
     <w:p>
       <w:r>
@@ -2354,13 +2277,3471 @@
       </w:r>
     </w:p>
     <w:p>
+      <w:r>
+        <w:t>Den udvalgte kode er min Gravi class</w:t>
+      </w:r>
+      <w:r>
+        <w:t xml:space="preserve">, Gravi stå for at beregne tyngdepåvirkningen mellem to eller flere objekter. Gravi classen har </w:t>
+      </w:r>
+    </w:p>
+    <w:tbl>
+      <w:tblPr>
+        <w:tblStyle w:val="TableGrid"/>
+        <w:tblW w:w="0" w:type="auto"/>
+        <w:tblLook w:val="04A0" w:firstRow="1" w:lastRow="0" w:firstColumn="1" w:lastColumn="0" w:noHBand="0" w:noVBand="1"/>
+      </w:tblPr>
+      <w:tblGrid>
+        <w:gridCol w:w="9016"/>
+      </w:tblGrid>
+      <w:tr>
+        <w:tc>
+          <w:tcPr>
+            <w:tcW w:w="9016" w:type="dxa"/>
+            <w:shd w:val="clear" w:color="auto" w:fill="F2F2F2" w:themeFill="background1" w:themeFillShade="F2"/>
+          </w:tcPr>
+          <w:p>
+            <w:pPr>
+              <w:rPr>
+                <w:rFonts w:ascii="Segoe MDL2 Assets" w:hAnsi="Segoe MDL2 Assets" w:cs="Times New Roman"/>
+                <w:lang w:val="en-DK"/>
+              </w:rPr>
+            </w:pPr>
+            <w:r>
+              <w:rPr>
+                <w:rFonts w:ascii="Segoe MDL2 Assets" w:hAnsi="Segoe MDL2 Assets" w:cs="Times New Roman"/>
+                <w:lang w:val="en-DK"/>
+              </w:rPr>
+              <w:t>import math</w:t>
+            </w:r>
+          </w:p>
+          <w:p>
+            <w:pPr>
+              <w:rPr>
+                <w:rFonts w:ascii="Segoe MDL2 Assets" w:hAnsi="Segoe MDL2 Assets" w:cs="Times New Roman"/>
+                <w:lang w:val="en-DK"/>
+              </w:rPr>
+            </w:pPr>
+            <w:r>
+              <w:rPr>
+                <w:rFonts w:ascii="Segoe MDL2 Assets" w:hAnsi="Segoe MDL2 Assets" w:cs="Times New Roman"/>
+                <w:lang w:val="en-DK"/>
+              </w:rPr>
+              <w:t xml:space="preserve">class </w:t>
+            </w:r>
+            <w:proofErr w:type="spellStart"/>
+            <w:r>
+              <w:rPr>
+                <w:rFonts w:ascii="Segoe MDL2 Assets" w:hAnsi="Segoe MDL2 Assets" w:cs="Times New Roman"/>
+                <w:lang w:val="en-DK"/>
+              </w:rPr>
+              <w:t>Gravi</w:t>
+            </w:r>
+            <w:proofErr w:type="spellEnd"/>
+            <w:r>
+              <w:rPr>
+                <w:rFonts w:ascii="Segoe MDL2 Assets" w:hAnsi="Segoe MDL2 Assets" w:cs="Times New Roman"/>
+                <w:lang w:val="en-DK"/>
+              </w:rPr>
+              <w:t>:</w:t>
+            </w:r>
+          </w:p>
+          <w:p>
+            <w:pPr>
+              <w:rPr>
+                <w:rFonts w:ascii="Segoe MDL2 Assets" w:hAnsi="Segoe MDL2 Assets" w:cs="Times New Roman"/>
+                <w:lang w:val="en-DK"/>
+              </w:rPr>
+            </w:pPr>
+            <w:r>
+              <w:rPr>
+                <w:rFonts w:ascii="Cambria" w:hAnsi="Cambria" w:cs="Cambria"/>
+                <w:lang w:val="en-DK"/>
+              </w:rPr>
+              <w:t> </w:t>
+            </w:r>
+            <w:r>
+              <w:rPr>
+                <w:rFonts w:ascii="Segoe MDL2 Assets" w:hAnsi="Segoe MDL2 Assets" w:cs="Times New Roman"/>
+                <w:lang w:val="en-DK"/>
+              </w:rPr>
+              <w:t xml:space="preserve"> </w:t>
+            </w:r>
+            <w:r>
+              <w:rPr>
+                <w:rFonts w:ascii="Cambria" w:hAnsi="Cambria" w:cs="Cambria"/>
+                <w:lang w:val="en-DK"/>
+              </w:rPr>
+              <w:t> </w:t>
+            </w:r>
+            <w:r>
+              <w:rPr>
+                <w:rFonts w:ascii="Segoe MDL2 Assets" w:hAnsi="Segoe MDL2 Assets" w:cs="Times New Roman"/>
+                <w:lang w:val="en-DK"/>
+              </w:rPr>
+              <w:t xml:space="preserve"> def __</w:t>
+            </w:r>
+            <w:proofErr w:type="spellStart"/>
+            <w:r>
+              <w:rPr>
+                <w:rFonts w:ascii="Segoe MDL2 Assets" w:hAnsi="Segoe MDL2 Assets" w:cs="Times New Roman"/>
+                <w:lang w:val="en-DK"/>
+              </w:rPr>
+              <w:t>init</w:t>
+            </w:r>
+            <w:proofErr w:type="spellEnd"/>
+            <w:r>
+              <w:rPr>
+                <w:rFonts w:ascii="Segoe MDL2 Assets" w:hAnsi="Segoe MDL2 Assets" w:cs="Times New Roman"/>
+                <w:lang w:val="en-DK"/>
+              </w:rPr>
+              <w:t>__(self) -&gt; None:</w:t>
+            </w:r>
+          </w:p>
+          <w:p>
+            <w:pPr>
+              <w:rPr>
+                <w:rFonts w:ascii="Segoe MDL2 Assets" w:hAnsi="Segoe MDL2 Assets" w:cs="Times New Roman"/>
+                <w:lang w:val="en-DK"/>
+              </w:rPr>
+            </w:pPr>
+            <w:r>
+              <w:rPr>
+                <w:rFonts w:ascii="Cambria" w:hAnsi="Cambria" w:cs="Cambria"/>
+                <w:lang w:val="en-DK"/>
+              </w:rPr>
+              <w:t> </w:t>
+            </w:r>
+            <w:r>
+              <w:rPr>
+                <w:rFonts w:ascii="Segoe MDL2 Assets" w:hAnsi="Segoe MDL2 Assets" w:cs="Times New Roman"/>
+                <w:lang w:val="en-DK"/>
+              </w:rPr>
+              <w:t xml:space="preserve"> </w:t>
+            </w:r>
+            <w:r>
+              <w:rPr>
+                <w:rFonts w:ascii="Cambria" w:hAnsi="Cambria" w:cs="Cambria"/>
+                <w:lang w:val="en-DK"/>
+              </w:rPr>
+              <w:t> </w:t>
+            </w:r>
+            <w:r>
+              <w:rPr>
+                <w:rFonts w:ascii="Segoe MDL2 Assets" w:hAnsi="Segoe MDL2 Assets" w:cs="Times New Roman"/>
+                <w:lang w:val="en-DK"/>
+              </w:rPr>
+              <w:t xml:space="preserve"> </w:t>
+            </w:r>
+            <w:r>
+              <w:rPr>
+                <w:rFonts w:ascii="Cambria" w:hAnsi="Cambria" w:cs="Cambria"/>
+                <w:lang w:val="en-DK"/>
+              </w:rPr>
+              <w:t> </w:t>
+            </w:r>
+            <w:r>
+              <w:rPr>
+                <w:rFonts w:ascii="Segoe MDL2 Assets" w:hAnsi="Segoe MDL2 Assets" w:cs="Times New Roman"/>
+                <w:lang w:val="en-DK"/>
+              </w:rPr>
+              <w:t xml:space="preserve"> </w:t>
+            </w:r>
+            <w:r>
+              <w:rPr>
+                <w:rFonts w:ascii="Cambria" w:hAnsi="Cambria" w:cs="Cambria"/>
+                <w:lang w:val="en-DK"/>
+              </w:rPr>
+              <w:t> </w:t>
+            </w:r>
+            <w:r>
+              <w:rPr>
+                <w:rFonts w:ascii="Segoe MDL2 Assets" w:hAnsi="Segoe MDL2 Assets" w:cs="Times New Roman"/>
+                <w:lang w:val="en-DK"/>
+              </w:rPr>
+              <w:t xml:space="preserve"> </w:t>
+            </w:r>
+            <w:proofErr w:type="spellStart"/>
+            <w:r>
+              <w:rPr>
+                <w:rFonts w:ascii="Segoe MDL2 Assets" w:hAnsi="Segoe MDL2 Assets" w:cs="Times New Roman"/>
+                <w:lang w:val="en-DK"/>
+              </w:rPr>
+              <w:t>self.G</w:t>
+            </w:r>
+            <w:proofErr w:type="spellEnd"/>
+            <w:r>
+              <w:rPr>
+                <w:rFonts w:ascii="Segoe MDL2 Assets" w:hAnsi="Segoe MDL2 Assets" w:cs="Times New Roman"/>
+                <w:lang w:val="en-DK"/>
+              </w:rPr>
+              <w:t>: float =</w:t>
+            </w:r>
+            <w:r>
+              <w:rPr>
+                <w:rFonts w:ascii="Cambria" w:hAnsi="Cambria" w:cs="Cambria"/>
+                <w:lang w:val="en-DK"/>
+              </w:rPr>
+              <w:t> </w:t>
+            </w:r>
+            <w:r>
+              <w:rPr>
+                <w:rFonts w:ascii="Segoe MDL2 Assets" w:hAnsi="Segoe MDL2 Assets" w:cs="Times New Roman"/>
+                <w:lang w:val="en-DK"/>
+              </w:rPr>
+              <w:t>6.67430 * (10**(-11))</w:t>
+            </w:r>
+          </w:p>
+          <w:p>
+            <w:pPr>
+              <w:rPr>
+                <w:rFonts w:ascii="Segoe MDL2 Assets" w:hAnsi="Segoe MDL2 Assets" w:cs="Times New Roman"/>
+                <w:lang w:val="en-DK"/>
+              </w:rPr>
+            </w:pPr>
+            <w:r>
+              <w:rPr>
+                <w:rFonts w:ascii="Cambria" w:hAnsi="Cambria" w:cs="Cambria"/>
+                <w:lang w:val="en-DK"/>
+              </w:rPr>
+              <w:t> </w:t>
+            </w:r>
+            <w:r>
+              <w:rPr>
+                <w:rFonts w:ascii="Segoe MDL2 Assets" w:hAnsi="Segoe MDL2 Assets" w:cs="Times New Roman"/>
+                <w:lang w:val="en-DK"/>
+              </w:rPr>
+              <w:t xml:space="preserve"> </w:t>
+            </w:r>
+            <w:r>
+              <w:rPr>
+                <w:rFonts w:ascii="Cambria" w:hAnsi="Cambria" w:cs="Cambria"/>
+                <w:lang w:val="en-DK"/>
+              </w:rPr>
+              <w:t> </w:t>
+            </w:r>
+            <w:r>
+              <w:rPr>
+                <w:rFonts w:ascii="Segoe MDL2 Assets" w:hAnsi="Segoe MDL2 Assets" w:cs="Times New Roman"/>
+                <w:lang w:val="en-DK"/>
+              </w:rPr>
+              <w:t xml:space="preserve"> </w:t>
+            </w:r>
+            <w:r>
+              <w:rPr>
+                <w:rFonts w:ascii="Cambria" w:hAnsi="Cambria" w:cs="Cambria"/>
+                <w:lang w:val="en-DK"/>
+              </w:rPr>
+              <w:t> </w:t>
+            </w:r>
+            <w:r>
+              <w:rPr>
+                <w:rFonts w:ascii="Segoe MDL2 Assets" w:hAnsi="Segoe MDL2 Assets" w:cs="Times New Roman"/>
+                <w:lang w:val="en-DK"/>
+              </w:rPr>
+              <w:t xml:space="preserve"> </w:t>
+            </w:r>
+            <w:r>
+              <w:rPr>
+                <w:rFonts w:ascii="Cambria" w:hAnsi="Cambria" w:cs="Cambria"/>
+                <w:lang w:val="en-DK"/>
+              </w:rPr>
+              <w:t> </w:t>
+            </w:r>
+            <w:r>
+              <w:rPr>
+                <w:rFonts w:ascii="Segoe MDL2 Assets" w:hAnsi="Segoe MDL2 Assets" w:cs="Times New Roman"/>
+                <w:lang w:val="en-DK"/>
+              </w:rPr>
+              <w:t xml:space="preserve"> </w:t>
+            </w:r>
+            <w:proofErr w:type="spellStart"/>
+            <w:r>
+              <w:rPr>
+                <w:rFonts w:ascii="Segoe MDL2 Assets" w:hAnsi="Segoe MDL2 Assets" w:cs="Times New Roman"/>
+                <w:lang w:val="en-DK"/>
+              </w:rPr>
+              <w:t>self.bodies</w:t>
+            </w:r>
+            <w:proofErr w:type="spellEnd"/>
+            <w:r>
+              <w:rPr>
+                <w:rFonts w:ascii="Segoe MDL2 Assets" w:hAnsi="Segoe MDL2 Assets" w:cs="Times New Roman"/>
+                <w:lang w:val="en-DK"/>
+              </w:rPr>
+              <w:t>: list = []</w:t>
+            </w:r>
+          </w:p>
+          <w:p>
+            <w:pPr>
+              <w:rPr>
+                <w:rFonts w:ascii="Segoe MDL2 Assets" w:hAnsi="Segoe MDL2 Assets" w:cs="Times New Roman"/>
+                <w:lang w:val="en-DK"/>
+              </w:rPr>
+            </w:pPr>
+            <w:r>
+              <w:rPr>
+                <w:rFonts w:ascii="Cambria" w:hAnsi="Cambria" w:cs="Cambria"/>
+                <w:lang w:val="en-DK"/>
+              </w:rPr>
+              <w:t> </w:t>
+            </w:r>
+            <w:r>
+              <w:rPr>
+                <w:rFonts w:ascii="Segoe MDL2 Assets" w:hAnsi="Segoe MDL2 Assets" w:cs="Times New Roman"/>
+                <w:lang w:val="en-DK"/>
+              </w:rPr>
+              <w:t xml:space="preserve"> </w:t>
+            </w:r>
+            <w:r>
+              <w:rPr>
+                <w:rFonts w:ascii="Cambria" w:hAnsi="Cambria" w:cs="Cambria"/>
+                <w:lang w:val="en-DK"/>
+              </w:rPr>
+              <w:t> </w:t>
+            </w:r>
+            <w:r>
+              <w:rPr>
+                <w:rFonts w:ascii="Segoe MDL2 Assets" w:hAnsi="Segoe MDL2 Assets" w:cs="Times New Roman"/>
+                <w:lang w:val="en-DK"/>
+              </w:rPr>
+              <w:t xml:space="preserve"> </w:t>
+            </w:r>
+            <w:r>
+              <w:rPr>
+                <w:rFonts w:ascii="Cambria" w:hAnsi="Cambria" w:cs="Cambria"/>
+                <w:lang w:val="en-DK"/>
+              </w:rPr>
+              <w:t> </w:t>
+            </w:r>
+            <w:r>
+              <w:rPr>
+                <w:rFonts w:ascii="Segoe MDL2 Assets" w:hAnsi="Segoe MDL2 Assets" w:cs="Times New Roman"/>
+                <w:lang w:val="en-DK"/>
+              </w:rPr>
+              <w:t xml:space="preserve"> </w:t>
+            </w:r>
+            <w:r>
+              <w:rPr>
+                <w:rFonts w:ascii="Cambria" w:hAnsi="Cambria" w:cs="Cambria"/>
+                <w:lang w:val="en-DK"/>
+              </w:rPr>
+              <w:t> </w:t>
+            </w:r>
+            <w:r>
+              <w:rPr>
+                <w:rFonts w:ascii="Segoe MDL2 Assets" w:hAnsi="Segoe MDL2 Assets" w:cs="Times New Roman"/>
+                <w:lang w:val="en-DK"/>
+              </w:rPr>
+              <w:t xml:space="preserve"> </w:t>
+            </w:r>
+            <w:proofErr w:type="spellStart"/>
+            <w:r>
+              <w:rPr>
+                <w:rFonts w:ascii="Segoe MDL2 Assets" w:hAnsi="Segoe MDL2 Assets" w:cs="Times New Roman"/>
+                <w:lang w:val="en-DK"/>
+              </w:rPr>
+              <w:t>self.QUEUE</w:t>
+            </w:r>
+            <w:proofErr w:type="spellEnd"/>
+            <w:r>
+              <w:rPr>
+                <w:rFonts w:ascii="Segoe MDL2 Assets" w:hAnsi="Segoe MDL2 Assets" w:cs="Times New Roman"/>
+                <w:lang w:val="en-DK"/>
+              </w:rPr>
+              <w:t>: list = []</w:t>
+            </w:r>
+          </w:p>
+          <w:p>
+            <w:pPr>
+              <w:rPr>
+                <w:rFonts w:ascii="Segoe MDL2 Assets" w:hAnsi="Segoe MDL2 Assets" w:cs="Times New Roman"/>
+                <w:lang w:val="en-DK"/>
+              </w:rPr>
+            </w:pPr>
+            <w:r>
+              <w:rPr>
+                <w:rFonts w:ascii="Cambria" w:hAnsi="Cambria" w:cs="Cambria"/>
+                <w:lang w:val="en-DK"/>
+              </w:rPr>
+              <w:t> </w:t>
+            </w:r>
+            <w:r>
+              <w:rPr>
+                <w:rFonts w:ascii="Segoe MDL2 Assets" w:hAnsi="Segoe MDL2 Assets" w:cs="Times New Roman"/>
+                <w:lang w:val="en-DK"/>
+              </w:rPr>
+              <w:t xml:space="preserve"> </w:t>
+            </w:r>
+            <w:r>
+              <w:rPr>
+                <w:rFonts w:ascii="Cambria" w:hAnsi="Cambria" w:cs="Cambria"/>
+                <w:lang w:val="en-DK"/>
+              </w:rPr>
+              <w:t> </w:t>
+            </w:r>
+            <w:r>
+              <w:rPr>
+                <w:rFonts w:ascii="Segoe MDL2 Assets" w:hAnsi="Segoe MDL2 Assets" w:cs="Times New Roman"/>
+                <w:lang w:val="en-DK"/>
+              </w:rPr>
+              <w:t xml:space="preserve"> </w:t>
+            </w:r>
+            <w:r>
+              <w:rPr>
+                <w:rFonts w:ascii="Cambria" w:hAnsi="Cambria" w:cs="Cambria"/>
+                <w:lang w:val="en-DK"/>
+              </w:rPr>
+              <w:t> </w:t>
+            </w:r>
+            <w:r>
+              <w:rPr>
+                <w:rFonts w:ascii="Segoe MDL2 Assets" w:hAnsi="Segoe MDL2 Assets" w:cs="Times New Roman"/>
+                <w:lang w:val="en-DK"/>
+              </w:rPr>
+              <w:t xml:space="preserve"> </w:t>
+            </w:r>
+            <w:r>
+              <w:rPr>
+                <w:rFonts w:ascii="Cambria" w:hAnsi="Cambria" w:cs="Cambria"/>
+                <w:lang w:val="en-DK"/>
+              </w:rPr>
+              <w:t> </w:t>
+            </w:r>
+            <w:r>
+              <w:rPr>
+                <w:rFonts w:ascii="Segoe MDL2 Assets" w:hAnsi="Segoe MDL2 Assets" w:cs="Times New Roman"/>
+                <w:lang w:val="en-DK"/>
+              </w:rPr>
+              <w:t xml:space="preserve"> </w:t>
+            </w:r>
+            <w:proofErr w:type="spellStart"/>
+            <w:r>
+              <w:rPr>
+                <w:rFonts w:ascii="Segoe MDL2 Assets" w:hAnsi="Segoe MDL2 Assets" w:cs="Times New Roman"/>
+                <w:lang w:val="en-DK"/>
+              </w:rPr>
+              <w:t>self.dt</w:t>
+            </w:r>
+            <w:proofErr w:type="spellEnd"/>
+            <w:r>
+              <w:rPr>
+                <w:rFonts w:ascii="Segoe MDL2 Assets" w:hAnsi="Segoe MDL2 Assets" w:cs="Times New Roman"/>
+                <w:lang w:val="en-DK"/>
+              </w:rPr>
+              <w:t>: float = 0.000001</w:t>
+            </w:r>
+          </w:p>
+          <w:p>
+            <w:pPr>
+              <w:rPr>
+                <w:rFonts w:ascii="Segoe MDL2 Assets" w:hAnsi="Segoe MDL2 Assets" w:cs="Times New Roman"/>
+                <w:lang w:val="en-DK"/>
+              </w:rPr>
+            </w:pPr>
+            <w:r>
+              <w:rPr>
+                <w:rFonts w:ascii="Cambria" w:hAnsi="Cambria" w:cs="Cambria"/>
+                <w:lang w:val="en-DK"/>
+              </w:rPr>
+              <w:t> </w:t>
+            </w:r>
+            <w:r>
+              <w:rPr>
+                <w:rFonts w:ascii="Segoe MDL2 Assets" w:hAnsi="Segoe MDL2 Assets" w:cs="Times New Roman"/>
+                <w:lang w:val="en-DK"/>
+              </w:rPr>
+              <w:t xml:space="preserve"> </w:t>
+            </w:r>
+            <w:r>
+              <w:rPr>
+                <w:rFonts w:ascii="Cambria" w:hAnsi="Cambria" w:cs="Cambria"/>
+                <w:lang w:val="en-DK"/>
+              </w:rPr>
+              <w:t> </w:t>
+            </w:r>
+            <w:r>
+              <w:rPr>
+                <w:rFonts w:ascii="Segoe MDL2 Assets" w:hAnsi="Segoe MDL2 Assets" w:cs="Times New Roman"/>
+                <w:lang w:val="en-DK"/>
+              </w:rPr>
+              <w:t xml:space="preserve"> </w:t>
+            </w:r>
+          </w:p>
+          <w:p>
+            <w:pPr>
+              <w:rPr>
+                <w:rFonts w:ascii="Segoe MDL2 Assets" w:hAnsi="Segoe MDL2 Assets" w:cs="Times New Roman"/>
+                <w:lang w:val="en-DK"/>
+              </w:rPr>
+            </w:pPr>
+            <w:r>
+              <w:rPr>
+                <w:rFonts w:ascii="Cambria" w:hAnsi="Cambria" w:cs="Cambria"/>
+                <w:lang w:val="en-DK"/>
+              </w:rPr>
+              <w:t> </w:t>
+            </w:r>
+            <w:r>
+              <w:rPr>
+                <w:rFonts w:ascii="Segoe MDL2 Assets" w:hAnsi="Segoe MDL2 Assets" w:cs="Times New Roman"/>
+                <w:lang w:val="en-DK"/>
+              </w:rPr>
+              <w:t xml:space="preserve"> </w:t>
+            </w:r>
+            <w:r>
+              <w:rPr>
+                <w:rFonts w:ascii="Cambria" w:hAnsi="Cambria" w:cs="Cambria"/>
+                <w:lang w:val="en-DK"/>
+              </w:rPr>
+              <w:t> </w:t>
+            </w:r>
+            <w:r>
+              <w:rPr>
+                <w:rFonts w:ascii="Segoe MDL2 Assets" w:hAnsi="Segoe MDL2 Assets" w:cs="Times New Roman"/>
+                <w:lang w:val="en-DK"/>
+              </w:rPr>
+              <w:t xml:space="preserve"> def </w:t>
+            </w:r>
+            <w:proofErr w:type="spellStart"/>
+            <w:r>
+              <w:rPr>
+                <w:rFonts w:ascii="Segoe MDL2 Assets" w:hAnsi="Segoe MDL2 Assets" w:cs="Times New Roman"/>
+                <w:b/>
+                <w:bCs/>
+                <w:lang w:val="en-DK"/>
+              </w:rPr>
+              <w:t>appenedBody</w:t>
+            </w:r>
+            <w:proofErr w:type="spellEnd"/>
+            <w:r>
+              <w:rPr>
+                <w:rFonts w:ascii="Segoe MDL2 Assets" w:hAnsi="Segoe MDL2 Assets" w:cs="Times New Roman"/>
+                <w:lang w:val="en-DK"/>
+              </w:rPr>
+              <w:t>(self, BODY):</w:t>
+            </w:r>
+          </w:p>
+          <w:p>
+            <w:pPr>
+              <w:rPr>
+                <w:rFonts w:ascii="Segoe MDL2 Assets" w:hAnsi="Segoe MDL2 Assets" w:cs="Times New Roman"/>
+                <w:lang w:val="en-DK"/>
+              </w:rPr>
+            </w:pPr>
+            <w:r>
+              <w:rPr>
+                <w:rFonts w:ascii="Cambria" w:hAnsi="Cambria" w:cs="Cambria"/>
+                <w:lang w:val="en-DK"/>
+              </w:rPr>
+              <w:t> </w:t>
+            </w:r>
+            <w:r>
+              <w:rPr>
+                <w:rFonts w:ascii="Segoe MDL2 Assets" w:hAnsi="Segoe MDL2 Assets" w:cs="Times New Roman"/>
+                <w:lang w:val="en-DK"/>
+              </w:rPr>
+              <w:t xml:space="preserve"> </w:t>
+            </w:r>
+            <w:r>
+              <w:rPr>
+                <w:rFonts w:ascii="Cambria" w:hAnsi="Cambria" w:cs="Cambria"/>
+                <w:lang w:val="en-DK"/>
+              </w:rPr>
+              <w:t> </w:t>
+            </w:r>
+            <w:r>
+              <w:rPr>
+                <w:rFonts w:ascii="Segoe MDL2 Assets" w:hAnsi="Segoe MDL2 Assets" w:cs="Times New Roman"/>
+                <w:lang w:val="en-DK"/>
+              </w:rPr>
+              <w:t xml:space="preserve"> </w:t>
+            </w:r>
+            <w:r>
+              <w:rPr>
+                <w:rFonts w:ascii="Cambria" w:hAnsi="Cambria" w:cs="Cambria"/>
+                <w:lang w:val="en-DK"/>
+              </w:rPr>
+              <w:t> </w:t>
+            </w:r>
+            <w:r>
+              <w:rPr>
+                <w:rFonts w:ascii="Segoe MDL2 Assets" w:hAnsi="Segoe MDL2 Assets" w:cs="Times New Roman"/>
+                <w:lang w:val="en-DK"/>
+              </w:rPr>
+              <w:t xml:space="preserve"> </w:t>
+            </w:r>
+            <w:r>
+              <w:rPr>
+                <w:rFonts w:ascii="Cambria" w:hAnsi="Cambria" w:cs="Cambria"/>
+                <w:lang w:val="en-DK"/>
+              </w:rPr>
+              <w:t> </w:t>
+            </w:r>
+            <w:r>
+              <w:rPr>
+                <w:rFonts w:ascii="Segoe MDL2 Assets" w:hAnsi="Segoe MDL2 Assets" w:cs="Times New Roman"/>
+                <w:lang w:val="en-DK"/>
+              </w:rPr>
+              <w:t xml:space="preserve"> </w:t>
+            </w:r>
+            <w:proofErr w:type="spellStart"/>
+            <w:r>
+              <w:rPr>
+                <w:rFonts w:ascii="Segoe MDL2 Assets" w:hAnsi="Segoe MDL2 Assets" w:cs="Times New Roman"/>
+                <w:lang w:val="en-DK"/>
+              </w:rPr>
+              <w:t>self.bodies.append</w:t>
+            </w:r>
+            <w:proofErr w:type="spellEnd"/>
+            <w:r>
+              <w:rPr>
+                <w:rFonts w:ascii="Segoe MDL2 Assets" w:hAnsi="Segoe MDL2 Assets" w:cs="Times New Roman"/>
+                <w:lang w:val="en-DK"/>
+              </w:rPr>
+              <w:t>(BODY)</w:t>
+            </w:r>
+          </w:p>
+          <w:p>
+            <w:pPr>
+              <w:rPr>
+                <w:rFonts w:ascii="Segoe MDL2 Assets" w:hAnsi="Segoe MDL2 Assets" w:cs="Times New Roman"/>
+                <w:lang w:val="en-DK"/>
+              </w:rPr>
+            </w:pPr>
+            <w:r>
+              <w:rPr>
+                <w:rFonts w:ascii="Cambria" w:hAnsi="Cambria" w:cs="Cambria"/>
+                <w:lang w:val="en-DK"/>
+              </w:rPr>
+              <w:lastRenderedPageBreak/>
+              <w:t> </w:t>
+            </w:r>
+            <w:r>
+              <w:rPr>
+                <w:rFonts w:ascii="Segoe MDL2 Assets" w:hAnsi="Segoe MDL2 Assets" w:cs="Times New Roman"/>
+                <w:lang w:val="en-DK"/>
+              </w:rPr>
+              <w:t xml:space="preserve"> </w:t>
+            </w:r>
+            <w:r>
+              <w:rPr>
+                <w:rFonts w:ascii="Cambria" w:hAnsi="Cambria" w:cs="Cambria"/>
+                <w:lang w:val="en-DK"/>
+              </w:rPr>
+              <w:t> </w:t>
+            </w:r>
+            <w:r>
+              <w:rPr>
+                <w:rFonts w:ascii="Segoe MDL2 Assets" w:hAnsi="Segoe MDL2 Assets" w:cs="Times New Roman"/>
+                <w:lang w:val="en-DK"/>
+              </w:rPr>
+              <w:t xml:space="preserve"> def </w:t>
+            </w:r>
+            <w:r>
+              <w:rPr>
+                <w:rFonts w:ascii="Segoe MDL2 Assets" w:hAnsi="Segoe MDL2 Assets" w:cs="Times New Roman"/>
+                <w:b/>
+                <w:bCs/>
+                <w:lang w:val="en-DK"/>
+              </w:rPr>
+              <w:t>compute</w:t>
+            </w:r>
+            <w:r>
+              <w:rPr>
+                <w:rFonts w:ascii="Segoe MDL2 Assets" w:hAnsi="Segoe MDL2 Assets" w:cs="Times New Roman"/>
+                <w:lang w:val="en-DK"/>
+              </w:rPr>
+              <w:t>(self):</w:t>
+            </w:r>
+          </w:p>
+          <w:p>
+            <w:pPr>
+              <w:rPr>
+                <w:rFonts w:ascii="Segoe MDL2 Assets" w:hAnsi="Segoe MDL2 Assets" w:cs="Times New Roman"/>
+                <w:lang w:val="en-DK"/>
+              </w:rPr>
+            </w:pPr>
+            <w:r>
+              <w:rPr>
+                <w:rFonts w:ascii="Cambria" w:hAnsi="Cambria" w:cs="Cambria"/>
+                <w:lang w:val="en-DK"/>
+              </w:rPr>
+              <w:t> </w:t>
+            </w:r>
+            <w:r>
+              <w:rPr>
+                <w:rFonts w:ascii="Segoe MDL2 Assets" w:hAnsi="Segoe MDL2 Assets" w:cs="Times New Roman"/>
+                <w:lang w:val="en-DK"/>
+              </w:rPr>
+              <w:t xml:space="preserve"> </w:t>
+            </w:r>
+            <w:r>
+              <w:rPr>
+                <w:rFonts w:ascii="Cambria" w:hAnsi="Cambria" w:cs="Cambria"/>
+                <w:lang w:val="en-DK"/>
+              </w:rPr>
+              <w:t> </w:t>
+            </w:r>
+            <w:r>
+              <w:rPr>
+                <w:rFonts w:ascii="Segoe MDL2 Assets" w:hAnsi="Segoe MDL2 Assets" w:cs="Times New Roman"/>
+                <w:lang w:val="en-DK"/>
+              </w:rPr>
+              <w:t xml:space="preserve"> </w:t>
+            </w:r>
+            <w:r>
+              <w:rPr>
+                <w:rFonts w:ascii="Cambria" w:hAnsi="Cambria" w:cs="Cambria"/>
+                <w:lang w:val="en-DK"/>
+              </w:rPr>
+              <w:t> </w:t>
+            </w:r>
+            <w:r>
+              <w:rPr>
+                <w:rFonts w:ascii="Segoe MDL2 Assets" w:hAnsi="Segoe MDL2 Assets" w:cs="Times New Roman"/>
+                <w:lang w:val="en-DK"/>
+              </w:rPr>
+              <w:t xml:space="preserve"> </w:t>
+            </w:r>
+            <w:r>
+              <w:rPr>
+                <w:rFonts w:ascii="Cambria" w:hAnsi="Cambria" w:cs="Cambria"/>
+                <w:lang w:val="en-DK"/>
+              </w:rPr>
+              <w:t> </w:t>
+            </w:r>
+            <w:r>
+              <w:rPr>
+                <w:rFonts w:ascii="Segoe MDL2 Assets" w:hAnsi="Segoe MDL2 Assets" w:cs="Times New Roman"/>
+                <w:lang w:val="en-DK"/>
+              </w:rPr>
+              <w:t xml:space="preserve"> for body1 in </w:t>
+            </w:r>
+            <w:proofErr w:type="spellStart"/>
+            <w:r>
+              <w:rPr>
+                <w:rFonts w:ascii="Segoe MDL2 Assets" w:hAnsi="Segoe MDL2 Assets" w:cs="Times New Roman"/>
+                <w:lang w:val="en-DK"/>
+              </w:rPr>
+              <w:t>self.bodies</w:t>
+            </w:r>
+            <w:proofErr w:type="spellEnd"/>
+            <w:r>
+              <w:rPr>
+                <w:rFonts w:ascii="Segoe MDL2 Assets" w:hAnsi="Segoe MDL2 Assets" w:cs="Times New Roman"/>
+                <w:lang w:val="en-DK"/>
+              </w:rPr>
+              <w:t>:</w:t>
+            </w:r>
+          </w:p>
+          <w:p>
+            <w:pPr>
+              <w:rPr>
+                <w:rFonts w:ascii="Segoe MDL2 Assets" w:hAnsi="Segoe MDL2 Assets" w:cs="Times New Roman"/>
+                <w:lang w:val="en-DK"/>
+              </w:rPr>
+            </w:pPr>
+            <w:r>
+              <w:rPr>
+                <w:rFonts w:ascii="Cambria" w:hAnsi="Cambria" w:cs="Cambria"/>
+                <w:lang w:val="en-DK"/>
+              </w:rPr>
+              <w:t> </w:t>
+            </w:r>
+            <w:r>
+              <w:rPr>
+                <w:rFonts w:ascii="Segoe MDL2 Assets" w:hAnsi="Segoe MDL2 Assets" w:cs="Times New Roman"/>
+                <w:lang w:val="en-DK"/>
+              </w:rPr>
+              <w:t xml:space="preserve"> </w:t>
+            </w:r>
+            <w:r>
+              <w:rPr>
+                <w:rFonts w:ascii="Cambria" w:hAnsi="Cambria" w:cs="Cambria"/>
+                <w:lang w:val="en-DK"/>
+              </w:rPr>
+              <w:t> </w:t>
+            </w:r>
+            <w:r>
+              <w:rPr>
+                <w:rFonts w:ascii="Segoe MDL2 Assets" w:hAnsi="Segoe MDL2 Assets" w:cs="Times New Roman"/>
+                <w:lang w:val="en-DK"/>
+              </w:rPr>
+              <w:t xml:space="preserve"> </w:t>
+            </w:r>
+            <w:r>
+              <w:rPr>
+                <w:rFonts w:ascii="Cambria" w:hAnsi="Cambria" w:cs="Cambria"/>
+                <w:lang w:val="en-DK"/>
+              </w:rPr>
+              <w:t> </w:t>
+            </w:r>
+            <w:r>
+              <w:rPr>
+                <w:rFonts w:ascii="Segoe MDL2 Assets" w:hAnsi="Segoe MDL2 Assets" w:cs="Times New Roman"/>
+                <w:lang w:val="en-DK"/>
+              </w:rPr>
+              <w:t xml:space="preserve"> </w:t>
+            </w:r>
+            <w:r>
+              <w:rPr>
+                <w:rFonts w:ascii="Cambria" w:hAnsi="Cambria" w:cs="Cambria"/>
+                <w:lang w:val="en-DK"/>
+              </w:rPr>
+              <w:t> </w:t>
+            </w:r>
+            <w:r>
+              <w:rPr>
+                <w:rFonts w:ascii="Segoe MDL2 Assets" w:hAnsi="Segoe MDL2 Assets" w:cs="Times New Roman"/>
+                <w:lang w:val="en-DK"/>
+              </w:rPr>
+              <w:t xml:space="preserve"> </w:t>
+            </w:r>
+            <w:r>
+              <w:rPr>
+                <w:rFonts w:ascii="Cambria" w:hAnsi="Cambria" w:cs="Cambria"/>
+                <w:lang w:val="en-DK"/>
+              </w:rPr>
+              <w:t> </w:t>
+            </w:r>
+            <w:r>
+              <w:rPr>
+                <w:rFonts w:ascii="Segoe MDL2 Assets" w:hAnsi="Segoe MDL2 Assets" w:cs="Times New Roman"/>
+                <w:lang w:val="en-DK"/>
+              </w:rPr>
+              <w:t xml:space="preserve"> </w:t>
+            </w:r>
+            <w:r>
+              <w:rPr>
+                <w:rFonts w:ascii="Cambria" w:hAnsi="Cambria" w:cs="Cambria"/>
+                <w:lang w:val="en-DK"/>
+              </w:rPr>
+              <w:t> </w:t>
+            </w:r>
+            <w:r>
+              <w:rPr>
+                <w:rFonts w:ascii="Segoe MDL2 Assets" w:hAnsi="Segoe MDL2 Assets" w:cs="Times New Roman"/>
+                <w:lang w:val="en-DK"/>
+              </w:rPr>
+              <w:t xml:space="preserve"> POS1 = body1.position</w:t>
+            </w:r>
+          </w:p>
+          <w:p>
+            <w:pPr>
+              <w:rPr>
+                <w:rFonts w:ascii="Segoe MDL2 Assets" w:hAnsi="Segoe MDL2 Assets" w:cs="Times New Roman"/>
+                <w:lang w:val="en-DK"/>
+              </w:rPr>
+            </w:pPr>
+            <w:r>
+              <w:rPr>
+                <w:rFonts w:ascii="Cambria" w:hAnsi="Cambria" w:cs="Cambria"/>
+                <w:lang w:val="en-DK"/>
+              </w:rPr>
+              <w:t> </w:t>
+            </w:r>
+            <w:r>
+              <w:rPr>
+                <w:rFonts w:ascii="Segoe MDL2 Assets" w:hAnsi="Segoe MDL2 Assets" w:cs="Times New Roman"/>
+                <w:lang w:val="en-DK"/>
+              </w:rPr>
+              <w:t xml:space="preserve"> </w:t>
+            </w:r>
+            <w:r>
+              <w:rPr>
+                <w:rFonts w:ascii="Cambria" w:hAnsi="Cambria" w:cs="Cambria"/>
+                <w:lang w:val="en-DK"/>
+              </w:rPr>
+              <w:t> </w:t>
+            </w:r>
+            <w:r>
+              <w:rPr>
+                <w:rFonts w:ascii="Segoe MDL2 Assets" w:hAnsi="Segoe MDL2 Assets" w:cs="Times New Roman"/>
+                <w:lang w:val="en-DK"/>
+              </w:rPr>
+              <w:t xml:space="preserve"> </w:t>
+            </w:r>
+            <w:r>
+              <w:rPr>
+                <w:rFonts w:ascii="Cambria" w:hAnsi="Cambria" w:cs="Cambria"/>
+                <w:lang w:val="en-DK"/>
+              </w:rPr>
+              <w:t> </w:t>
+            </w:r>
+            <w:r>
+              <w:rPr>
+                <w:rFonts w:ascii="Segoe MDL2 Assets" w:hAnsi="Segoe MDL2 Assets" w:cs="Times New Roman"/>
+                <w:lang w:val="en-DK"/>
+              </w:rPr>
+              <w:t xml:space="preserve"> </w:t>
+            </w:r>
+            <w:r>
+              <w:rPr>
+                <w:rFonts w:ascii="Cambria" w:hAnsi="Cambria" w:cs="Cambria"/>
+                <w:lang w:val="en-DK"/>
+              </w:rPr>
+              <w:t> </w:t>
+            </w:r>
+            <w:r>
+              <w:rPr>
+                <w:rFonts w:ascii="Segoe MDL2 Assets" w:hAnsi="Segoe MDL2 Assets" w:cs="Times New Roman"/>
+                <w:lang w:val="en-DK"/>
+              </w:rPr>
+              <w:t xml:space="preserve"> </w:t>
+            </w:r>
+            <w:r>
+              <w:rPr>
+                <w:rFonts w:ascii="Cambria" w:hAnsi="Cambria" w:cs="Cambria"/>
+                <w:lang w:val="en-DK"/>
+              </w:rPr>
+              <w:t> </w:t>
+            </w:r>
+            <w:r>
+              <w:rPr>
+                <w:rFonts w:ascii="Segoe MDL2 Assets" w:hAnsi="Segoe MDL2 Assets" w:cs="Times New Roman"/>
+                <w:lang w:val="en-DK"/>
+              </w:rPr>
+              <w:t xml:space="preserve"> </w:t>
+            </w:r>
+            <w:r>
+              <w:rPr>
+                <w:rFonts w:ascii="Cambria" w:hAnsi="Cambria" w:cs="Cambria"/>
+                <w:lang w:val="en-DK"/>
+              </w:rPr>
+              <w:t> </w:t>
+            </w:r>
+            <w:r>
+              <w:rPr>
+                <w:rFonts w:ascii="Segoe MDL2 Assets" w:hAnsi="Segoe MDL2 Assets" w:cs="Times New Roman"/>
+                <w:lang w:val="en-DK"/>
+              </w:rPr>
+              <w:t xml:space="preserve"> VELOCITY = body1.velocity</w:t>
+            </w:r>
+          </w:p>
+          <w:p>
+            <w:pPr>
+              <w:rPr>
+                <w:rFonts w:ascii="Segoe MDL2 Assets" w:hAnsi="Segoe MDL2 Assets" w:cs="Times New Roman"/>
+                <w:lang w:val="en-DK"/>
+              </w:rPr>
+            </w:pPr>
+          </w:p>
+          <w:p>
+            <w:pPr>
+              <w:rPr>
+                <w:rFonts w:ascii="Segoe MDL2 Assets" w:hAnsi="Segoe MDL2 Assets" w:cs="Times New Roman"/>
+                <w:lang w:val="en-DK"/>
+              </w:rPr>
+            </w:pPr>
+            <w:r>
+              <w:rPr>
+                <w:rFonts w:ascii="Cambria" w:hAnsi="Cambria" w:cs="Cambria"/>
+                <w:lang w:val="en-DK"/>
+              </w:rPr>
+              <w:t> </w:t>
+            </w:r>
+            <w:r>
+              <w:rPr>
+                <w:rFonts w:ascii="Segoe MDL2 Assets" w:hAnsi="Segoe MDL2 Assets" w:cs="Times New Roman"/>
+                <w:lang w:val="en-DK"/>
+              </w:rPr>
+              <w:t xml:space="preserve"> </w:t>
+            </w:r>
+            <w:r>
+              <w:rPr>
+                <w:rFonts w:ascii="Cambria" w:hAnsi="Cambria" w:cs="Cambria"/>
+                <w:lang w:val="en-DK"/>
+              </w:rPr>
+              <w:t> </w:t>
+            </w:r>
+            <w:r>
+              <w:rPr>
+                <w:rFonts w:ascii="Segoe MDL2 Assets" w:hAnsi="Segoe MDL2 Assets" w:cs="Times New Roman"/>
+                <w:lang w:val="en-DK"/>
+              </w:rPr>
+              <w:t xml:space="preserve"> </w:t>
+            </w:r>
+            <w:r>
+              <w:rPr>
+                <w:rFonts w:ascii="Cambria" w:hAnsi="Cambria" w:cs="Cambria"/>
+                <w:lang w:val="en-DK"/>
+              </w:rPr>
+              <w:t> </w:t>
+            </w:r>
+            <w:r>
+              <w:rPr>
+                <w:rFonts w:ascii="Segoe MDL2 Assets" w:hAnsi="Segoe MDL2 Assets" w:cs="Times New Roman"/>
+                <w:lang w:val="en-DK"/>
+              </w:rPr>
+              <w:t xml:space="preserve"> </w:t>
+            </w:r>
+            <w:r>
+              <w:rPr>
+                <w:rFonts w:ascii="Cambria" w:hAnsi="Cambria" w:cs="Cambria"/>
+                <w:lang w:val="en-DK"/>
+              </w:rPr>
+              <w:t> </w:t>
+            </w:r>
+            <w:r>
+              <w:rPr>
+                <w:rFonts w:ascii="Segoe MDL2 Assets" w:hAnsi="Segoe MDL2 Assets" w:cs="Times New Roman"/>
+                <w:lang w:val="en-DK"/>
+              </w:rPr>
+              <w:t xml:space="preserve"> </w:t>
+            </w:r>
+            <w:r>
+              <w:rPr>
+                <w:rFonts w:ascii="Cambria" w:hAnsi="Cambria" w:cs="Cambria"/>
+                <w:lang w:val="en-DK"/>
+              </w:rPr>
+              <w:t> </w:t>
+            </w:r>
+            <w:r>
+              <w:rPr>
+                <w:rFonts w:ascii="Segoe MDL2 Assets" w:hAnsi="Segoe MDL2 Assets" w:cs="Times New Roman"/>
+                <w:lang w:val="en-DK"/>
+              </w:rPr>
+              <w:t xml:space="preserve"> </w:t>
+            </w:r>
+            <w:r>
+              <w:rPr>
+                <w:rFonts w:ascii="Cambria" w:hAnsi="Cambria" w:cs="Cambria"/>
+                <w:lang w:val="en-DK"/>
+              </w:rPr>
+              <w:t> </w:t>
+            </w:r>
+            <w:r>
+              <w:rPr>
+                <w:rFonts w:ascii="Segoe MDL2 Assets" w:hAnsi="Segoe MDL2 Assets" w:cs="Times New Roman"/>
+                <w:lang w:val="en-DK"/>
+              </w:rPr>
+              <w:t xml:space="preserve"> </w:t>
+            </w:r>
+            <w:proofErr w:type="spellStart"/>
+            <w:r>
+              <w:rPr>
+                <w:rFonts w:ascii="Segoe MDL2 Assets" w:hAnsi="Segoe MDL2 Assets" w:cs="Times New Roman"/>
+                <w:lang w:val="en-DK"/>
+              </w:rPr>
+              <w:t>ax</w:t>
+            </w:r>
+            <w:proofErr w:type="spellEnd"/>
+            <w:r>
+              <w:rPr>
+                <w:rFonts w:ascii="Segoe MDL2 Assets" w:hAnsi="Segoe MDL2 Assets" w:cs="Times New Roman"/>
+                <w:lang w:val="en-DK"/>
+              </w:rPr>
+              <w:t xml:space="preserve"> = 0</w:t>
+            </w:r>
+          </w:p>
+          <w:p>
+            <w:pPr>
+              <w:rPr>
+                <w:rFonts w:ascii="Segoe MDL2 Assets" w:hAnsi="Segoe MDL2 Assets" w:cs="Times New Roman"/>
+                <w:lang w:val="en-DK"/>
+              </w:rPr>
+            </w:pPr>
+            <w:r>
+              <w:rPr>
+                <w:rFonts w:ascii="Cambria" w:hAnsi="Cambria" w:cs="Cambria"/>
+                <w:lang w:val="en-DK"/>
+              </w:rPr>
+              <w:t> </w:t>
+            </w:r>
+            <w:r>
+              <w:rPr>
+                <w:rFonts w:ascii="Segoe MDL2 Assets" w:hAnsi="Segoe MDL2 Assets" w:cs="Times New Roman"/>
+                <w:lang w:val="en-DK"/>
+              </w:rPr>
+              <w:t xml:space="preserve"> </w:t>
+            </w:r>
+            <w:r>
+              <w:rPr>
+                <w:rFonts w:ascii="Cambria" w:hAnsi="Cambria" w:cs="Cambria"/>
+                <w:lang w:val="en-DK"/>
+              </w:rPr>
+              <w:t> </w:t>
+            </w:r>
+            <w:r>
+              <w:rPr>
+                <w:rFonts w:ascii="Segoe MDL2 Assets" w:hAnsi="Segoe MDL2 Assets" w:cs="Times New Roman"/>
+                <w:lang w:val="en-DK"/>
+              </w:rPr>
+              <w:t xml:space="preserve"> </w:t>
+            </w:r>
+            <w:r>
+              <w:rPr>
+                <w:rFonts w:ascii="Cambria" w:hAnsi="Cambria" w:cs="Cambria"/>
+                <w:lang w:val="en-DK"/>
+              </w:rPr>
+              <w:t> </w:t>
+            </w:r>
+            <w:r>
+              <w:rPr>
+                <w:rFonts w:ascii="Segoe MDL2 Assets" w:hAnsi="Segoe MDL2 Assets" w:cs="Times New Roman"/>
+                <w:lang w:val="en-DK"/>
+              </w:rPr>
+              <w:t xml:space="preserve"> </w:t>
+            </w:r>
+            <w:r>
+              <w:rPr>
+                <w:rFonts w:ascii="Cambria" w:hAnsi="Cambria" w:cs="Cambria"/>
+                <w:lang w:val="en-DK"/>
+              </w:rPr>
+              <w:t> </w:t>
+            </w:r>
+            <w:r>
+              <w:rPr>
+                <w:rFonts w:ascii="Segoe MDL2 Assets" w:hAnsi="Segoe MDL2 Assets" w:cs="Times New Roman"/>
+                <w:lang w:val="en-DK"/>
+              </w:rPr>
+              <w:t xml:space="preserve"> </w:t>
+            </w:r>
+            <w:r>
+              <w:rPr>
+                <w:rFonts w:ascii="Cambria" w:hAnsi="Cambria" w:cs="Cambria"/>
+                <w:lang w:val="en-DK"/>
+              </w:rPr>
+              <w:t> </w:t>
+            </w:r>
+            <w:r>
+              <w:rPr>
+                <w:rFonts w:ascii="Segoe MDL2 Assets" w:hAnsi="Segoe MDL2 Assets" w:cs="Times New Roman"/>
+                <w:lang w:val="en-DK"/>
+              </w:rPr>
+              <w:t xml:space="preserve"> </w:t>
+            </w:r>
+            <w:r>
+              <w:rPr>
+                <w:rFonts w:ascii="Cambria" w:hAnsi="Cambria" w:cs="Cambria"/>
+                <w:lang w:val="en-DK"/>
+              </w:rPr>
+              <w:t> </w:t>
+            </w:r>
+            <w:r>
+              <w:rPr>
+                <w:rFonts w:ascii="Segoe MDL2 Assets" w:hAnsi="Segoe MDL2 Assets" w:cs="Times New Roman"/>
+                <w:lang w:val="en-DK"/>
+              </w:rPr>
+              <w:t xml:space="preserve"> ay = 0</w:t>
+            </w:r>
+          </w:p>
+          <w:p>
+            <w:pPr>
+              <w:rPr>
+                <w:rFonts w:ascii="Segoe MDL2 Assets" w:hAnsi="Segoe MDL2 Assets" w:cs="Times New Roman"/>
+                <w:lang w:val="en-DK"/>
+              </w:rPr>
+            </w:pPr>
+          </w:p>
+          <w:p>
+            <w:pPr>
+              <w:rPr>
+                <w:rFonts w:ascii="Segoe MDL2 Assets" w:hAnsi="Segoe MDL2 Assets" w:cs="Times New Roman"/>
+                <w:lang w:val="en-DK"/>
+              </w:rPr>
+            </w:pPr>
+            <w:r>
+              <w:rPr>
+                <w:rFonts w:ascii="Cambria" w:hAnsi="Cambria" w:cs="Cambria"/>
+                <w:lang w:val="en-DK"/>
+              </w:rPr>
+              <w:t> </w:t>
+            </w:r>
+            <w:r>
+              <w:rPr>
+                <w:rFonts w:ascii="Segoe MDL2 Assets" w:hAnsi="Segoe MDL2 Assets" w:cs="Times New Roman"/>
+                <w:lang w:val="en-DK"/>
+              </w:rPr>
+              <w:t xml:space="preserve"> </w:t>
+            </w:r>
+            <w:r>
+              <w:rPr>
+                <w:rFonts w:ascii="Cambria" w:hAnsi="Cambria" w:cs="Cambria"/>
+                <w:lang w:val="en-DK"/>
+              </w:rPr>
+              <w:t> </w:t>
+            </w:r>
+            <w:r>
+              <w:rPr>
+                <w:rFonts w:ascii="Segoe MDL2 Assets" w:hAnsi="Segoe MDL2 Assets" w:cs="Times New Roman"/>
+                <w:lang w:val="en-DK"/>
+              </w:rPr>
+              <w:t xml:space="preserve"> </w:t>
+            </w:r>
+            <w:r>
+              <w:rPr>
+                <w:rFonts w:ascii="Cambria" w:hAnsi="Cambria" w:cs="Cambria"/>
+                <w:lang w:val="en-DK"/>
+              </w:rPr>
+              <w:t> </w:t>
+            </w:r>
+            <w:r>
+              <w:rPr>
+                <w:rFonts w:ascii="Segoe MDL2 Assets" w:hAnsi="Segoe MDL2 Assets" w:cs="Times New Roman"/>
+                <w:lang w:val="en-DK"/>
+              </w:rPr>
+              <w:t xml:space="preserve"> </w:t>
+            </w:r>
+            <w:r>
+              <w:rPr>
+                <w:rFonts w:ascii="Cambria" w:hAnsi="Cambria" w:cs="Cambria"/>
+                <w:lang w:val="en-DK"/>
+              </w:rPr>
+              <w:t> </w:t>
+            </w:r>
+            <w:r>
+              <w:rPr>
+                <w:rFonts w:ascii="Segoe MDL2 Assets" w:hAnsi="Segoe MDL2 Assets" w:cs="Times New Roman"/>
+                <w:lang w:val="en-DK"/>
+              </w:rPr>
+              <w:t xml:space="preserve"> </w:t>
+            </w:r>
+            <w:r>
+              <w:rPr>
+                <w:rFonts w:ascii="Cambria" w:hAnsi="Cambria" w:cs="Cambria"/>
+                <w:lang w:val="en-DK"/>
+              </w:rPr>
+              <w:t> </w:t>
+            </w:r>
+            <w:r>
+              <w:rPr>
+                <w:rFonts w:ascii="Segoe MDL2 Assets" w:hAnsi="Segoe MDL2 Assets" w:cs="Times New Roman"/>
+                <w:lang w:val="en-DK"/>
+              </w:rPr>
+              <w:t xml:space="preserve"> </w:t>
+            </w:r>
+            <w:r>
+              <w:rPr>
+                <w:rFonts w:ascii="Cambria" w:hAnsi="Cambria" w:cs="Cambria"/>
+                <w:lang w:val="en-DK"/>
+              </w:rPr>
+              <w:t> </w:t>
+            </w:r>
+            <w:r>
+              <w:rPr>
+                <w:rFonts w:ascii="Segoe MDL2 Assets" w:hAnsi="Segoe MDL2 Assets" w:cs="Times New Roman"/>
+                <w:lang w:val="en-DK"/>
+              </w:rPr>
+              <w:t xml:space="preserve"> for body2 in </w:t>
+            </w:r>
+            <w:proofErr w:type="spellStart"/>
+            <w:r>
+              <w:rPr>
+                <w:rFonts w:ascii="Segoe MDL2 Assets" w:hAnsi="Segoe MDL2 Assets" w:cs="Times New Roman"/>
+                <w:lang w:val="en-DK"/>
+              </w:rPr>
+              <w:t>self.bodies</w:t>
+            </w:r>
+            <w:proofErr w:type="spellEnd"/>
+            <w:r>
+              <w:rPr>
+                <w:rFonts w:ascii="Segoe MDL2 Assets" w:hAnsi="Segoe MDL2 Assets" w:cs="Times New Roman"/>
+                <w:lang w:val="en-DK"/>
+              </w:rPr>
+              <w:t>:</w:t>
+            </w:r>
+          </w:p>
+          <w:p>
+            <w:pPr>
+              <w:rPr>
+                <w:rFonts w:ascii="Segoe MDL2 Assets" w:hAnsi="Segoe MDL2 Assets" w:cs="Times New Roman"/>
+                <w:lang w:val="en-DK"/>
+              </w:rPr>
+            </w:pPr>
+            <w:r>
+              <w:rPr>
+                <w:rFonts w:ascii="Cambria" w:hAnsi="Cambria" w:cs="Cambria"/>
+                <w:lang w:val="en-DK"/>
+              </w:rPr>
+              <w:t> </w:t>
+            </w:r>
+            <w:r>
+              <w:rPr>
+                <w:rFonts w:ascii="Segoe MDL2 Assets" w:hAnsi="Segoe MDL2 Assets" w:cs="Times New Roman"/>
+                <w:lang w:val="en-DK"/>
+              </w:rPr>
+              <w:t xml:space="preserve"> </w:t>
+            </w:r>
+            <w:r>
+              <w:rPr>
+                <w:rFonts w:ascii="Cambria" w:hAnsi="Cambria" w:cs="Cambria"/>
+                <w:lang w:val="en-DK"/>
+              </w:rPr>
+              <w:t> </w:t>
+            </w:r>
+            <w:r>
+              <w:rPr>
+                <w:rFonts w:ascii="Segoe MDL2 Assets" w:hAnsi="Segoe MDL2 Assets" w:cs="Times New Roman"/>
+                <w:lang w:val="en-DK"/>
+              </w:rPr>
+              <w:t xml:space="preserve"> </w:t>
+            </w:r>
+            <w:r>
+              <w:rPr>
+                <w:rFonts w:ascii="Cambria" w:hAnsi="Cambria" w:cs="Cambria"/>
+                <w:lang w:val="en-DK"/>
+              </w:rPr>
+              <w:t> </w:t>
+            </w:r>
+            <w:r>
+              <w:rPr>
+                <w:rFonts w:ascii="Segoe MDL2 Assets" w:hAnsi="Segoe MDL2 Assets" w:cs="Times New Roman"/>
+                <w:lang w:val="en-DK"/>
+              </w:rPr>
+              <w:t xml:space="preserve"> </w:t>
+            </w:r>
+            <w:r>
+              <w:rPr>
+                <w:rFonts w:ascii="Cambria" w:hAnsi="Cambria" w:cs="Cambria"/>
+                <w:lang w:val="en-DK"/>
+              </w:rPr>
+              <w:t> </w:t>
+            </w:r>
+            <w:r>
+              <w:rPr>
+                <w:rFonts w:ascii="Segoe MDL2 Assets" w:hAnsi="Segoe MDL2 Assets" w:cs="Times New Roman"/>
+                <w:lang w:val="en-DK"/>
+              </w:rPr>
+              <w:t xml:space="preserve"> </w:t>
+            </w:r>
+            <w:r>
+              <w:rPr>
+                <w:rFonts w:ascii="Cambria" w:hAnsi="Cambria" w:cs="Cambria"/>
+                <w:lang w:val="en-DK"/>
+              </w:rPr>
+              <w:t> </w:t>
+            </w:r>
+            <w:r>
+              <w:rPr>
+                <w:rFonts w:ascii="Segoe MDL2 Assets" w:hAnsi="Segoe MDL2 Assets" w:cs="Times New Roman"/>
+                <w:lang w:val="en-DK"/>
+              </w:rPr>
+              <w:t xml:space="preserve"> </w:t>
+            </w:r>
+            <w:r>
+              <w:rPr>
+                <w:rFonts w:ascii="Cambria" w:hAnsi="Cambria" w:cs="Cambria"/>
+                <w:lang w:val="en-DK"/>
+              </w:rPr>
+              <w:t> </w:t>
+            </w:r>
+            <w:r>
+              <w:rPr>
+                <w:rFonts w:ascii="Segoe MDL2 Assets" w:hAnsi="Segoe MDL2 Assets" w:cs="Times New Roman"/>
+                <w:lang w:val="en-DK"/>
+              </w:rPr>
+              <w:t xml:space="preserve"> </w:t>
+            </w:r>
+            <w:r>
+              <w:rPr>
+                <w:rFonts w:ascii="Cambria" w:hAnsi="Cambria" w:cs="Cambria"/>
+                <w:lang w:val="en-DK"/>
+              </w:rPr>
+              <w:t> </w:t>
+            </w:r>
+            <w:r>
+              <w:rPr>
+                <w:rFonts w:ascii="Segoe MDL2 Assets" w:hAnsi="Segoe MDL2 Assets" w:cs="Times New Roman"/>
+                <w:lang w:val="en-DK"/>
+              </w:rPr>
+              <w:t xml:space="preserve"> </w:t>
+            </w:r>
+            <w:r>
+              <w:rPr>
+                <w:rFonts w:ascii="Cambria" w:hAnsi="Cambria" w:cs="Cambria"/>
+                <w:lang w:val="en-DK"/>
+              </w:rPr>
+              <w:t> </w:t>
+            </w:r>
+            <w:r>
+              <w:rPr>
+                <w:rFonts w:ascii="Segoe MDL2 Assets" w:hAnsi="Segoe MDL2 Assets" w:cs="Times New Roman"/>
+                <w:lang w:val="en-DK"/>
+              </w:rPr>
+              <w:t xml:space="preserve"> if body2 is body1:</w:t>
+            </w:r>
+          </w:p>
+          <w:p>
+            <w:pPr>
+              <w:rPr>
+                <w:rFonts w:ascii="Segoe MDL2 Assets" w:hAnsi="Segoe MDL2 Assets" w:cs="Times New Roman"/>
+                <w:lang w:val="en-DK"/>
+              </w:rPr>
+            </w:pPr>
+            <w:r>
+              <w:rPr>
+                <w:rFonts w:ascii="Cambria" w:hAnsi="Cambria" w:cs="Cambria"/>
+                <w:lang w:val="en-DK"/>
+              </w:rPr>
+              <w:t> </w:t>
+            </w:r>
+            <w:r>
+              <w:rPr>
+                <w:rFonts w:ascii="Segoe MDL2 Assets" w:hAnsi="Segoe MDL2 Assets" w:cs="Times New Roman"/>
+                <w:lang w:val="en-DK"/>
+              </w:rPr>
+              <w:t xml:space="preserve"> </w:t>
+            </w:r>
+            <w:r>
+              <w:rPr>
+                <w:rFonts w:ascii="Cambria" w:hAnsi="Cambria" w:cs="Cambria"/>
+                <w:lang w:val="en-DK"/>
+              </w:rPr>
+              <w:t> </w:t>
+            </w:r>
+            <w:r>
+              <w:rPr>
+                <w:rFonts w:ascii="Segoe MDL2 Assets" w:hAnsi="Segoe MDL2 Assets" w:cs="Times New Roman"/>
+                <w:lang w:val="en-DK"/>
+              </w:rPr>
+              <w:t xml:space="preserve"> </w:t>
+            </w:r>
+            <w:r>
+              <w:rPr>
+                <w:rFonts w:ascii="Cambria" w:hAnsi="Cambria" w:cs="Cambria"/>
+                <w:lang w:val="en-DK"/>
+              </w:rPr>
+              <w:t> </w:t>
+            </w:r>
+            <w:r>
+              <w:rPr>
+                <w:rFonts w:ascii="Segoe MDL2 Assets" w:hAnsi="Segoe MDL2 Assets" w:cs="Times New Roman"/>
+                <w:lang w:val="en-DK"/>
+              </w:rPr>
+              <w:t xml:space="preserve"> </w:t>
+            </w:r>
+            <w:r>
+              <w:rPr>
+                <w:rFonts w:ascii="Cambria" w:hAnsi="Cambria" w:cs="Cambria"/>
+                <w:lang w:val="en-DK"/>
+              </w:rPr>
+              <w:t> </w:t>
+            </w:r>
+            <w:r>
+              <w:rPr>
+                <w:rFonts w:ascii="Segoe MDL2 Assets" w:hAnsi="Segoe MDL2 Assets" w:cs="Times New Roman"/>
+                <w:lang w:val="en-DK"/>
+              </w:rPr>
+              <w:t xml:space="preserve"> </w:t>
+            </w:r>
+            <w:r>
+              <w:rPr>
+                <w:rFonts w:ascii="Cambria" w:hAnsi="Cambria" w:cs="Cambria"/>
+                <w:lang w:val="en-DK"/>
+              </w:rPr>
+              <w:t> </w:t>
+            </w:r>
+            <w:r>
+              <w:rPr>
+                <w:rFonts w:ascii="Segoe MDL2 Assets" w:hAnsi="Segoe MDL2 Assets" w:cs="Times New Roman"/>
+                <w:lang w:val="en-DK"/>
+              </w:rPr>
+              <w:t xml:space="preserve"> </w:t>
+            </w:r>
+            <w:r>
+              <w:rPr>
+                <w:rFonts w:ascii="Cambria" w:hAnsi="Cambria" w:cs="Cambria"/>
+                <w:lang w:val="en-DK"/>
+              </w:rPr>
+              <w:t> </w:t>
+            </w:r>
+            <w:r>
+              <w:rPr>
+                <w:rFonts w:ascii="Segoe MDL2 Assets" w:hAnsi="Segoe MDL2 Assets" w:cs="Times New Roman"/>
+                <w:lang w:val="en-DK"/>
+              </w:rPr>
+              <w:t xml:space="preserve"> </w:t>
+            </w:r>
+            <w:r>
+              <w:rPr>
+                <w:rFonts w:ascii="Cambria" w:hAnsi="Cambria" w:cs="Cambria"/>
+                <w:lang w:val="en-DK"/>
+              </w:rPr>
+              <w:t> </w:t>
+            </w:r>
+            <w:r>
+              <w:rPr>
+                <w:rFonts w:ascii="Segoe MDL2 Assets" w:hAnsi="Segoe MDL2 Assets" w:cs="Times New Roman"/>
+                <w:lang w:val="en-DK"/>
+              </w:rPr>
+              <w:t xml:space="preserve"> </w:t>
+            </w:r>
+            <w:r>
+              <w:rPr>
+                <w:rFonts w:ascii="Cambria" w:hAnsi="Cambria" w:cs="Cambria"/>
+                <w:lang w:val="en-DK"/>
+              </w:rPr>
+              <w:t> </w:t>
+            </w:r>
+            <w:r>
+              <w:rPr>
+                <w:rFonts w:ascii="Segoe MDL2 Assets" w:hAnsi="Segoe MDL2 Assets" w:cs="Times New Roman"/>
+                <w:lang w:val="en-DK"/>
+              </w:rPr>
+              <w:t xml:space="preserve"> </w:t>
+            </w:r>
+            <w:r>
+              <w:rPr>
+                <w:rFonts w:ascii="Cambria" w:hAnsi="Cambria" w:cs="Cambria"/>
+                <w:lang w:val="en-DK"/>
+              </w:rPr>
+              <w:t> </w:t>
+            </w:r>
+            <w:r>
+              <w:rPr>
+                <w:rFonts w:ascii="Segoe MDL2 Assets" w:hAnsi="Segoe MDL2 Assets" w:cs="Times New Roman"/>
+                <w:lang w:val="en-DK"/>
+              </w:rPr>
+              <w:t xml:space="preserve"> </w:t>
+            </w:r>
+            <w:r>
+              <w:rPr>
+                <w:rFonts w:ascii="Cambria" w:hAnsi="Cambria" w:cs="Cambria"/>
+                <w:lang w:val="en-DK"/>
+              </w:rPr>
+              <w:t> </w:t>
+            </w:r>
+            <w:r>
+              <w:rPr>
+                <w:rFonts w:ascii="Segoe MDL2 Assets" w:hAnsi="Segoe MDL2 Assets" w:cs="Times New Roman"/>
+                <w:lang w:val="en-DK"/>
+              </w:rPr>
+              <w:t xml:space="preserve"> continue</w:t>
+            </w:r>
+          </w:p>
+          <w:p>
+            <w:pPr>
+              <w:rPr>
+                <w:rFonts w:ascii="Segoe MDL2 Assets" w:hAnsi="Segoe MDL2 Assets" w:cs="Times New Roman"/>
+                <w:lang w:val="en-DK"/>
+              </w:rPr>
+            </w:pPr>
+          </w:p>
+          <w:p>
+            <w:pPr>
+              <w:rPr>
+                <w:rFonts w:ascii="Segoe MDL2 Assets" w:hAnsi="Segoe MDL2 Assets" w:cs="Times New Roman"/>
+                <w:lang w:val="en-DK"/>
+              </w:rPr>
+            </w:pPr>
+            <w:r>
+              <w:rPr>
+                <w:rFonts w:ascii="Cambria" w:hAnsi="Cambria" w:cs="Cambria"/>
+                <w:lang w:val="en-DK"/>
+              </w:rPr>
+              <w:t> </w:t>
+            </w:r>
+            <w:r>
+              <w:rPr>
+                <w:rFonts w:ascii="Segoe MDL2 Assets" w:hAnsi="Segoe MDL2 Assets" w:cs="Times New Roman"/>
+                <w:lang w:val="en-DK"/>
+              </w:rPr>
+              <w:t xml:space="preserve"> </w:t>
+            </w:r>
+            <w:r>
+              <w:rPr>
+                <w:rFonts w:ascii="Cambria" w:hAnsi="Cambria" w:cs="Cambria"/>
+                <w:lang w:val="en-DK"/>
+              </w:rPr>
+              <w:t> </w:t>
+            </w:r>
+            <w:r>
+              <w:rPr>
+                <w:rFonts w:ascii="Segoe MDL2 Assets" w:hAnsi="Segoe MDL2 Assets" w:cs="Times New Roman"/>
+                <w:lang w:val="en-DK"/>
+              </w:rPr>
+              <w:t xml:space="preserve"> </w:t>
+            </w:r>
+            <w:r>
+              <w:rPr>
+                <w:rFonts w:ascii="Cambria" w:hAnsi="Cambria" w:cs="Cambria"/>
+                <w:lang w:val="en-DK"/>
+              </w:rPr>
+              <w:t> </w:t>
+            </w:r>
+            <w:r>
+              <w:rPr>
+                <w:rFonts w:ascii="Segoe MDL2 Assets" w:hAnsi="Segoe MDL2 Assets" w:cs="Times New Roman"/>
+                <w:lang w:val="en-DK"/>
+              </w:rPr>
+              <w:t xml:space="preserve"> </w:t>
+            </w:r>
+            <w:r>
+              <w:rPr>
+                <w:rFonts w:ascii="Cambria" w:hAnsi="Cambria" w:cs="Cambria"/>
+                <w:lang w:val="en-DK"/>
+              </w:rPr>
+              <w:t> </w:t>
+            </w:r>
+            <w:r>
+              <w:rPr>
+                <w:rFonts w:ascii="Segoe MDL2 Assets" w:hAnsi="Segoe MDL2 Assets" w:cs="Times New Roman"/>
+                <w:lang w:val="en-DK"/>
+              </w:rPr>
+              <w:t xml:space="preserve"> </w:t>
+            </w:r>
+            <w:r>
+              <w:rPr>
+                <w:rFonts w:ascii="Cambria" w:hAnsi="Cambria" w:cs="Cambria"/>
+                <w:lang w:val="en-DK"/>
+              </w:rPr>
+              <w:t> </w:t>
+            </w:r>
+            <w:r>
+              <w:rPr>
+                <w:rFonts w:ascii="Segoe MDL2 Assets" w:hAnsi="Segoe MDL2 Assets" w:cs="Times New Roman"/>
+                <w:lang w:val="en-DK"/>
+              </w:rPr>
+              <w:t xml:space="preserve"> </w:t>
+            </w:r>
+            <w:r>
+              <w:rPr>
+                <w:rFonts w:ascii="Cambria" w:hAnsi="Cambria" w:cs="Cambria"/>
+                <w:lang w:val="en-DK"/>
+              </w:rPr>
+              <w:t> </w:t>
+            </w:r>
+            <w:r>
+              <w:rPr>
+                <w:rFonts w:ascii="Segoe MDL2 Assets" w:hAnsi="Segoe MDL2 Assets" w:cs="Times New Roman"/>
+                <w:lang w:val="en-DK"/>
+              </w:rPr>
+              <w:t xml:space="preserve"> </w:t>
+            </w:r>
+            <w:r>
+              <w:rPr>
+                <w:rFonts w:ascii="Cambria" w:hAnsi="Cambria" w:cs="Cambria"/>
+                <w:lang w:val="en-DK"/>
+              </w:rPr>
+              <w:t> </w:t>
+            </w:r>
+            <w:r>
+              <w:rPr>
+                <w:rFonts w:ascii="Segoe MDL2 Assets" w:hAnsi="Segoe MDL2 Assets" w:cs="Times New Roman"/>
+                <w:lang w:val="en-DK"/>
+              </w:rPr>
+              <w:t xml:space="preserve"> </w:t>
+            </w:r>
+            <w:r>
+              <w:rPr>
+                <w:rFonts w:ascii="Cambria" w:hAnsi="Cambria" w:cs="Cambria"/>
+                <w:lang w:val="en-DK"/>
+              </w:rPr>
+              <w:t> </w:t>
+            </w:r>
+            <w:r>
+              <w:rPr>
+                <w:rFonts w:ascii="Segoe MDL2 Assets" w:hAnsi="Segoe MDL2 Assets" w:cs="Times New Roman"/>
+                <w:lang w:val="en-DK"/>
+              </w:rPr>
+              <w:t xml:space="preserve"> POS2 = body2.position</w:t>
+            </w:r>
+          </w:p>
+          <w:p>
+            <w:pPr>
+              <w:rPr>
+                <w:rFonts w:ascii="Segoe MDL2 Assets" w:hAnsi="Segoe MDL2 Assets" w:cs="Times New Roman"/>
+                <w:lang w:val="en-DK"/>
+              </w:rPr>
+            </w:pPr>
+            <w:r>
+              <w:rPr>
+                <w:rFonts w:ascii="Cambria" w:hAnsi="Cambria" w:cs="Cambria"/>
+                <w:lang w:val="en-DK"/>
+              </w:rPr>
+              <w:t> </w:t>
+            </w:r>
+            <w:r>
+              <w:rPr>
+                <w:rFonts w:ascii="Segoe MDL2 Assets" w:hAnsi="Segoe MDL2 Assets" w:cs="Times New Roman"/>
+                <w:lang w:val="en-DK"/>
+              </w:rPr>
+              <w:t xml:space="preserve"> </w:t>
+            </w:r>
+            <w:r>
+              <w:rPr>
+                <w:rFonts w:ascii="Cambria" w:hAnsi="Cambria" w:cs="Cambria"/>
+                <w:lang w:val="en-DK"/>
+              </w:rPr>
+              <w:t> </w:t>
+            </w:r>
+            <w:r>
+              <w:rPr>
+                <w:rFonts w:ascii="Segoe MDL2 Assets" w:hAnsi="Segoe MDL2 Assets" w:cs="Times New Roman"/>
+                <w:lang w:val="en-DK"/>
+              </w:rPr>
+              <w:t xml:space="preserve"> </w:t>
+            </w:r>
+            <w:r>
+              <w:rPr>
+                <w:rFonts w:ascii="Cambria" w:hAnsi="Cambria" w:cs="Cambria"/>
+                <w:lang w:val="en-DK"/>
+              </w:rPr>
+              <w:t> </w:t>
+            </w:r>
+            <w:r>
+              <w:rPr>
+                <w:rFonts w:ascii="Segoe MDL2 Assets" w:hAnsi="Segoe MDL2 Assets" w:cs="Times New Roman"/>
+                <w:lang w:val="en-DK"/>
+              </w:rPr>
+              <w:t xml:space="preserve"> </w:t>
+            </w:r>
+            <w:r>
+              <w:rPr>
+                <w:rFonts w:ascii="Cambria" w:hAnsi="Cambria" w:cs="Cambria"/>
+                <w:lang w:val="en-DK"/>
+              </w:rPr>
+              <w:t> </w:t>
+            </w:r>
+            <w:r>
+              <w:rPr>
+                <w:rFonts w:ascii="Segoe MDL2 Assets" w:hAnsi="Segoe MDL2 Assets" w:cs="Times New Roman"/>
+                <w:lang w:val="en-DK"/>
+              </w:rPr>
+              <w:t xml:space="preserve"> </w:t>
+            </w:r>
+            <w:r>
+              <w:rPr>
+                <w:rFonts w:ascii="Cambria" w:hAnsi="Cambria" w:cs="Cambria"/>
+                <w:lang w:val="en-DK"/>
+              </w:rPr>
+              <w:t> </w:t>
+            </w:r>
+            <w:r>
+              <w:rPr>
+                <w:rFonts w:ascii="Segoe MDL2 Assets" w:hAnsi="Segoe MDL2 Assets" w:cs="Times New Roman"/>
+                <w:lang w:val="en-DK"/>
+              </w:rPr>
+              <w:t xml:space="preserve"> </w:t>
+            </w:r>
+            <w:r>
+              <w:rPr>
+                <w:rFonts w:ascii="Cambria" w:hAnsi="Cambria" w:cs="Cambria"/>
+                <w:lang w:val="en-DK"/>
+              </w:rPr>
+              <w:t> </w:t>
+            </w:r>
+            <w:r>
+              <w:rPr>
+                <w:rFonts w:ascii="Segoe MDL2 Assets" w:hAnsi="Segoe MDL2 Assets" w:cs="Times New Roman"/>
+                <w:lang w:val="en-DK"/>
+              </w:rPr>
+              <w:t xml:space="preserve"> </w:t>
+            </w:r>
+            <w:r>
+              <w:rPr>
+                <w:rFonts w:ascii="Cambria" w:hAnsi="Cambria" w:cs="Cambria"/>
+                <w:lang w:val="en-DK"/>
+              </w:rPr>
+              <w:t> </w:t>
+            </w:r>
+            <w:r>
+              <w:rPr>
+                <w:rFonts w:ascii="Segoe MDL2 Assets" w:hAnsi="Segoe MDL2 Assets" w:cs="Times New Roman"/>
+                <w:lang w:val="en-DK"/>
+              </w:rPr>
+              <w:t xml:space="preserve"> </w:t>
+            </w:r>
+            <w:r>
+              <w:rPr>
+                <w:rFonts w:ascii="Cambria" w:hAnsi="Cambria" w:cs="Cambria"/>
+                <w:lang w:val="en-DK"/>
+              </w:rPr>
+              <w:t> </w:t>
+            </w:r>
+            <w:r>
+              <w:rPr>
+                <w:rFonts w:ascii="Segoe MDL2 Assets" w:hAnsi="Segoe MDL2 Assets" w:cs="Times New Roman"/>
+                <w:lang w:val="en-DK"/>
+              </w:rPr>
+              <w:t xml:space="preserve"> MASS = body2.mass</w:t>
+            </w:r>
+          </w:p>
+          <w:p>
+            <w:pPr>
+              <w:rPr>
+                <w:rFonts w:ascii="Segoe MDL2 Assets" w:hAnsi="Segoe MDL2 Assets" w:cs="Times New Roman"/>
+                <w:lang w:val="en-DK"/>
+              </w:rPr>
+            </w:pPr>
+          </w:p>
+          <w:p>
+            <w:pPr>
+              <w:rPr>
+                <w:rFonts w:ascii="Segoe MDL2 Assets" w:hAnsi="Segoe MDL2 Assets" w:cs="Times New Roman"/>
+                <w:lang w:val="en-DK"/>
+              </w:rPr>
+            </w:pPr>
+            <w:r>
+              <w:rPr>
+                <w:rFonts w:ascii="Cambria" w:hAnsi="Cambria" w:cs="Cambria"/>
+                <w:lang w:val="en-DK"/>
+              </w:rPr>
+              <w:t> </w:t>
+            </w:r>
+            <w:r>
+              <w:rPr>
+                <w:rFonts w:ascii="Segoe MDL2 Assets" w:hAnsi="Segoe MDL2 Assets" w:cs="Times New Roman"/>
+                <w:lang w:val="en-DK"/>
+              </w:rPr>
+              <w:t xml:space="preserve"> </w:t>
+            </w:r>
+            <w:r>
+              <w:rPr>
+                <w:rFonts w:ascii="Cambria" w:hAnsi="Cambria" w:cs="Cambria"/>
+                <w:lang w:val="en-DK"/>
+              </w:rPr>
+              <w:t> </w:t>
+            </w:r>
+            <w:r>
+              <w:rPr>
+                <w:rFonts w:ascii="Segoe MDL2 Assets" w:hAnsi="Segoe MDL2 Assets" w:cs="Times New Roman"/>
+                <w:lang w:val="en-DK"/>
+              </w:rPr>
+              <w:t xml:space="preserve"> </w:t>
+            </w:r>
+            <w:r>
+              <w:rPr>
+                <w:rFonts w:ascii="Cambria" w:hAnsi="Cambria" w:cs="Cambria"/>
+                <w:lang w:val="en-DK"/>
+              </w:rPr>
+              <w:t> </w:t>
+            </w:r>
+            <w:r>
+              <w:rPr>
+                <w:rFonts w:ascii="Segoe MDL2 Assets" w:hAnsi="Segoe MDL2 Assets" w:cs="Times New Roman"/>
+                <w:lang w:val="en-DK"/>
+              </w:rPr>
+              <w:t xml:space="preserve"> </w:t>
+            </w:r>
+            <w:r>
+              <w:rPr>
+                <w:rFonts w:ascii="Cambria" w:hAnsi="Cambria" w:cs="Cambria"/>
+                <w:lang w:val="en-DK"/>
+              </w:rPr>
+              <w:t> </w:t>
+            </w:r>
+            <w:r>
+              <w:rPr>
+                <w:rFonts w:ascii="Segoe MDL2 Assets" w:hAnsi="Segoe MDL2 Assets" w:cs="Times New Roman"/>
+                <w:lang w:val="en-DK"/>
+              </w:rPr>
+              <w:t xml:space="preserve"> </w:t>
+            </w:r>
+            <w:r>
+              <w:rPr>
+                <w:rFonts w:ascii="Cambria" w:hAnsi="Cambria" w:cs="Cambria"/>
+                <w:lang w:val="en-DK"/>
+              </w:rPr>
+              <w:t> </w:t>
+            </w:r>
+            <w:r>
+              <w:rPr>
+                <w:rFonts w:ascii="Segoe MDL2 Assets" w:hAnsi="Segoe MDL2 Assets" w:cs="Times New Roman"/>
+                <w:lang w:val="en-DK"/>
+              </w:rPr>
+              <w:t xml:space="preserve"> </w:t>
+            </w:r>
+            <w:r>
+              <w:rPr>
+                <w:rFonts w:ascii="Cambria" w:hAnsi="Cambria" w:cs="Cambria"/>
+                <w:lang w:val="en-DK"/>
+              </w:rPr>
+              <w:t> </w:t>
+            </w:r>
+            <w:r>
+              <w:rPr>
+                <w:rFonts w:ascii="Segoe MDL2 Assets" w:hAnsi="Segoe MDL2 Assets" w:cs="Times New Roman"/>
+                <w:lang w:val="en-DK"/>
+              </w:rPr>
+              <w:t xml:space="preserve"> </w:t>
+            </w:r>
+            <w:r>
+              <w:rPr>
+                <w:rFonts w:ascii="Cambria" w:hAnsi="Cambria" w:cs="Cambria"/>
+                <w:lang w:val="en-DK"/>
+              </w:rPr>
+              <w:t> </w:t>
+            </w:r>
+            <w:r>
+              <w:rPr>
+                <w:rFonts w:ascii="Segoe MDL2 Assets" w:hAnsi="Segoe MDL2 Assets" w:cs="Times New Roman"/>
+                <w:lang w:val="en-DK"/>
+              </w:rPr>
+              <w:t xml:space="preserve"> </w:t>
+            </w:r>
+            <w:r>
+              <w:rPr>
+                <w:rFonts w:ascii="Cambria" w:hAnsi="Cambria" w:cs="Cambria"/>
+                <w:lang w:val="en-DK"/>
+              </w:rPr>
+              <w:t> </w:t>
+            </w:r>
+            <w:r>
+              <w:rPr>
+                <w:rFonts w:ascii="Segoe MDL2 Assets" w:hAnsi="Segoe MDL2 Assets" w:cs="Times New Roman"/>
+                <w:lang w:val="en-DK"/>
+              </w:rPr>
+              <w:t xml:space="preserve"> dx = POS2[0] - POS1[0]</w:t>
+            </w:r>
+          </w:p>
+          <w:p>
+            <w:pPr>
+              <w:rPr>
+                <w:rFonts w:ascii="Segoe MDL2 Assets" w:hAnsi="Segoe MDL2 Assets" w:cs="Times New Roman"/>
+                <w:lang w:val="en-DK"/>
+              </w:rPr>
+            </w:pPr>
+            <w:r>
+              <w:rPr>
+                <w:rFonts w:ascii="Cambria" w:hAnsi="Cambria" w:cs="Cambria"/>
+                <w:lang w:val="en-DK"/>
+              </w:rPr>
+              <w:t> </w:t>
+            </w:r>
+            <w:r>
+              <w:rPr>
+                <w:rFonts w:ascii="Segoe MDL2 Assets" w:hAnsi="Segoe MDL2 Assets" w:cs="Times New Roman"/>
+                <w:lang w:val="en-DK"/>
+              </w:rPr>
+              <w:t xml:space="preserve"> </w:t>
+            </w:r>
+            <w:r>
+              <w:rPr>
+                <w:rFonts w:ascii="Cambria" w:hAnsi="Cambria" w:cs="Cambria"/>
+                <w:lang w:val="en-DK"/>
+              </w:rPr>
+              <w:t> </w:t>
+            </w:r>
+            <w:r>
+              <w:rPr>
+                <w:rFonts w:ascii="Segoe MDL2 Assets" w:hAnsi="Segoe MDL2 Assets" w:cs="Times New Roman"/>
+                <w:lang w:val="en-DK"/>
+              </w:rPr>
+              <w:t xml:space="preserve"> </w:t>
+            </w:r>
+            <w:r>
+              <w:rPr>
+                <w:rFonts w:ascii="Cambria" w:hAnsi="Cambria" w:cs="Cambria"/>
+                <w:lang w:val="en-DK"/>
+              </w:rPr>
+              <w:t> </w:t>
+            </w:r>
+            <w:r>
+              <w:rPr>
+                <w:rFonts w:ascii="Segoe MDL2 Assets" w:hAnsi="Segoe MDL2 Assets" w:cs="Times New Roman"/>
+                <w:lang w:val="en-DK"/>
+              </w:rPr>
+              <w:t xml:space="preserve"> </w:t>
+            </w:r>
+            <w:r>
+              <w:rPr>
+                <w:rFonts w:ascii="Cambria" w:hAnsi="Cambria" w:cs="Cambria"/>
+                <w:lang w:val="en-DK"/>
+              </w:rPr>
+              <w:t> </w:t>
+            </w:r>
+            <w:r>
+              <w:rPr>
+                <w:rFonts w:ascii="Segoe MDL2 Assets" w:hAnsi="Segoe MDL2 Assets" w:cs="Times New Roman"/>
+                <w:lang w:val="en-DK"/>
+              </w:rPr>
+              <w:t xml:space="preserve"> </w:t>
+            </w:r>
+            <w:r>
+              <w:rPr>
+                <w:rFonts w:ascii="Cambria" w:hAnsi="Cambria" w:cs="Cambria"/>
+                <w:lang w:val="en-DK"/>
+              </w:rPr>
+              <w:t> </w:t>
+            </w:r>
+            <w:r>
+              <w:rPr>
+                <w:rFonts w:ascii="Segoe MDL2 Assets" w:hAnsi="Segoe MDL2 Assets" w:cs="Times New Roman"/>
+                <w:lang w:val="en-DK"/>
+              </w:rPr>
+              <w:t xml:space="preserve"> </w:t>
+            </w:r>
+            <w:r>
+              <w:rPr>
+                <w:rFonts w:ascii="Cambria" w:hAnsi="Cambria" w:cs="Cambria"/>
+                <w:lang w:val="en-DK"/>
+              </w:rPr>
+              <w:t> </w:t>
+            </w:r>
+            <w:r>
+              <w:rPr>
+                <w:rFonts w:ascii="Segoe MDL2 Assets" w:hAnsi="Segoe MDL2 Assets" w:cs="Times New Roman"/>
+                <w:lang w:val="en-DK"/>
+              </w:rPr>
+              <w:t xml:space="preserve"> </w:t>
+            </w:r>
+            <w:r>
+              <w:rPr>
+                <w:rFonts w:ascii="Cambria" w:hAnsi="Cambria" w:cs="Cambria"/>
+                <w:lang w:val="en-DK"/>
+              </w:rPr>
+              <w:t> </w:t>
+            </w:r>
+            <w:r>
+              <w:rPr>
+                <w:rFonts w:ascii="Segoe MDL2 Assets" w:hAnsi="Segoe MDL2 Assets" w:cs="Times New Roman"/>
+                <w:lang w:val="en-DK"/>
+              </w:rPr>
+              <w:t xml:space="preserve"> </w:t>
+            </w:r>
+            <w:r>
+              <w:rPr>
+                <w:rFonts w:ascii="Cambria" w:hAnsi="Cambria" w:cs="Cambria"/>
+                <w:lang w:val="en-DK"/>
+              </w:rPr>
+              <w:t> </w:t>
+            </w:r>
+            <w:r>
+              <w:rPr>
+                <w:rFonts w:ascii="Segoe MDL2 Assets" w:hAnsi="Segoe MDL2 Assets" w:cs="Times New Roman"/>
+                <w:lang w:val="en-DK"/>
+              </w:rPr>
+              <w:t xml:space="preserve"> </w:t>
+            </w:r>
+            <w:proofErr w:type="spellStart"/>
+            <w:r>
+              <w:rPr>
+                <w:rFonts w:ascii="Segoe MDL2 Assets" w:hAnsi="Segoe MDL2 Assets" w:cs="Times New Roman"/>
+                <w:lang w:val="en-DK"/>
+              </w:rPr>
+              <w:t>dy</w:t>
+            </w:r>
+            <w:proofErr w:type="spellEnd"/>
+            <w:r>
+              <w:rPr>
+                <w:rFonts w:ascii="Segoe MDL2 Assets" w:hAnsi="Segoe MDL2 Assets" w:cs="Times New Roman"/>
+                <w:lang w:val="en-DK"/>
+              </w:rPr>
+              <w:t xml:space="preserve"> = POS2[1] - POS1[1]</w:t>
+            </w:r>
+          </w:p>
+          <w:p>
+            <w:pPr>
+              <w:rPr>
+                <w:rFonts w:ascii="Segoe MDL2 Assets" w:hAnsi="Segoe MDL2 Assets" w:cs="Times New Roman"/>
+                <w:lang w:val="en-DK"/>
+              </w:rPr>
+            </w:pPr>
+          </w:p>
+          <w:p>
+            <w:pPr>
+              <w:rPr>
+                <w:rFonts w:ascii="Segoe MDL2 Assets" w:hAnsi="Segoe MDL2 Assets" w:cs="Times New Roman"/>
+                <w:lang w:val="en-DK"/>
+              </w:rPr>
+            </w:pPr>
+            <w:r>
+              <w:rPr>
+                <w:rFonts w:ascii="Cambria" w:hAnsi="Cambria" w:cs="Cambria"/>
+                <w:lang w:val="en-DK"/>
+              </w:rPr>
+              <w:t> </w:t>
+            </w:r>
+            <w:r>
+              <w:rPr>
+                <w:rFonts w:ascii="Segoe MDL2 Assets" w:hAnsi="Segoe MDL2 Assets" w:cs="Times New Roman"/>
+                <w:lang w:val="en-DK"/>
+              </w:rPr>
+              <w:t xml:space="preserve"> </w:t>
+            </w:r>
+            <w:r>
+              <w:rPr>
+                <w:rFonts w:ascii="Cambria" w:hAnsi="Cambria" w:cs="Cambria"/>
+                <w:lang w:val="en-DK"/>
+              </w:rPr>
+              <w:t> </w:t>
+            </w:r>
+            <w:r>
+              <w:rPr>
+                <w:rFonts w:ascii="Segoe MDL2 Assets" w:hAnsi="Segoe MDL2 Assets" w:cs="Times New Roman"/>
+                <w:lang w:val="en-DK"/>
+              </w:rPr>
+              <w:t xml:space="preserve"> </w:t>
+            </w:r>
+            <w:r>
+              <w:rPr>
+                <w:rFonts w:ascii="Cambria" w:hAnsi="Cambria" w:cs="Cambria"/>
+                <w:lang w:val="en-DK"/>
+              </w:rPr>
+              <w:t> </w:t>
+            </w:r>
+            <w:r>
+              <w:rPr>
+                <w:rFonts w:ascii="Segoe MDL2 Assets" w:hAnsi="Segoe MDL2 Assets" w:cs="Times New Roman"/>
+                <w:lang w:val="en-DK"/>
+              </w:rPr>
+              <w:t xml:space="preserve"> </w:t>
+            </w:r>
+            <w:r>
+              <w:rPr>
+                <w:rFonts w:ascii="Cambria" w:hAnsi="Cambria" w:cs="Cambria"/>
+                <w:lang w:val="en-DK"/>
+              </w:rPr>
+              <w:t> </w:t>
+            </w:r>
+            <w:r>
+              <w:rPr>
+                <w:rFonts w:ascii="Segoe MDL2 Assets" w:hAnsi="Segoe MDL2 Assets" w:cs="Times New Roman"/>
+                <w:lang w:val="en-DK"/>
+              </w:rPr>
+              <w:t xml:space="preserve"> </w:t>
+            </w:r>
+            <w:r>
+              <w:rPr>
+                <w:rFonts w:ascii="Cambria" w:hAnsi="Cambria" w:cs="Cambria"/>
+                <w:lang w:val="en-DK"/>
+              </w:rPr>
+              <w:t> </w:t>
+            </w:r>
+            <w:r>
+              <w:rPr>
+                <w:rFonts w:ascii="Segoe MDL2 Assets" w:hAnsi="Segoe MDL2 Assets" w:cs="Times New Roman"/>
+                <w:lang w:val="en-DK"/>
+              </w:rPr>
+              <w:t xml:space="preserve"> </w:t>
+            </w:r>
+            <w:r>
+              <w:rPr>
+                <w:rFonts w:ascii="Cambria" w:hAnsi="Cambria" w:cs="Cambria"/>
+                <w:lang w:val="en-DK"/>
+              </w:rPr>
+              <w:t> </w:t>
+            </w:r>
+            <w:r>
+              <w:rPr>
+                <w:rFonts w:ascii="Segoe MDL2 Assets" w:hAnsi="Segoe MDL2 Assets" w:cs="Times New Roman"/>
+                <w:lang w:val="en-DK"/>
+              </w:rPr>
+              <w:t xml:space="preserve"> </w:t>
+            </w:r>
+            <w:r>
+              <w:rPr>
+                <w:rFonts w:ascii="Cambria" w:hAnsi="Cambria" w:cs="Cambria"/>
+                <w:lang w:val="en-DK"/>
+              </w:rPr>
+              <w:t> </w:t>
+            </w:r>
+            <w:r>
+              <w:rPr>
+                <w:rFonts w:ascii="Segoe MDL2 Assets" w:hAnsi="Segoe MDL2 Assets" w:cs="Times New Roman"/>
+                <w:lang w:val="en-DK"/>
+              </w:rPr>
+              <w:t xml:space="preserve"> </w:t>
+            </w:r>
+            <w:r>
+              <w:rPr>
+                <w:rFonts w:ascii="Cambria" w:hAnsi="Cambria" w:cs="Cambria"/>
+                <w:lang w:val="en-DK"/>
+              </w:rPr>
+              <w:t> </w:t>
+            </w:r>
+            <w:r>
+              <w:rPr>
+                <w:rFonts w:ascii="Segoe MDL2 Assets" w:hAnsi="Segoe MDL2 Assets" w:cs="Times New Roman"/>
+                <w:lang w:val="en-DK"/>
+              </w:rPr>
+              <w:t xml:space="preserve"> dist = </w:t>
+            </w:r>
+            <w:proofErr w:type="spellStart"/>
+            <w:r>
+              <w:rPr>
+                <w:rFonts w:ascii="Segoe MDL2 Assets" w:hAnsi="Segoe MDL2 Assets" w:cs="Times New Roman"/>
+                <w:lang w:val="en-DK"/>
+              </w:rPr>
+              <w:t>math.sqrt</w:t>
+            </w:r>
+            <w:proofErr w:type="spellEnd"/>
+            <w:r>
+              <w:rPr>
+                <w:rFonts w:ascii="Segoe MDL2 Assets" w:hAnsi="Segoe MDL2 Assets" w:cs="Times New Roman"/>
+                <w:lang w:val="en-DK"/>
+              </w:rPr>
+              <w:t xml:space="preserve">(dx**2 + </w:t>
+            </w:r>
+            <w:proofErr w:type="spellStart"/>
+            <w:r>
+              <w:rPr>
+                <w:rFonts w:ascii="Segoe MDL2 Assets" w:hAnsi="Segoe MDL2 Assets" w:cs="Times New Roman"/>
+                <w:lang w:val="en-DK"/>
+              </w:rPr>
+              <w:t>dy</w:t>
+            </w:r>
+            <w:proofErr w:type="spellEnd"/>
+            <w:r>
+              <w:rPr>
+                <w:rFonts w:ascii="Segoe MDL2 Assets" w:hAnsi="Segoe MDL2 Assets" w:cs="Times New Roman"/>
+                <w:lang w:val="en-DK"/>
+              </w:rPr>
+              <w:t>**2)</w:t>
+            </w:r>
+          </w:p>
+          <w:p>
+            <w:pPr>
+              <w:rPr>
+                <w:rFonts w:ascii="Segoe MDL2 Assets" w:hAnsi="Segoe MDL2 Assets" w:cs="Times New Roman"/>
+                <w:lang w:val="en-DK"/>
+              </w:rPr>
+            </w:pPr>
+          </w:p>
+          <w:p>
+            <w:pPr>
+              <w:rPr>
+                <w:rFonts w:ascii="Segoe MDL2 Assets" w:hAnsi="Segoe MDL2 Assets" w:cs="Times New Roman"/>
+                <w:lang w:val="en-DK"/>
+              </w:rPr>
+            </w:pPr>
+            <w:r>
+              <w:rPr>
+                <w:rFonts w:ascii="Cambria" w:hAnsi="Cambria" w:cs="Cambria"/>
+                <w:lang w:val="en-DK"/>
+              </w:rPr>
+              <w:t> </w:t>
+            </w:r>
+            <w:r>
+              <w:rPr>
+                <w:rFonts w:ascii="Segoe MDL2 Assets" w:hAnsi="Segoe MDL2 Assets" w:cs="Times New Roman"/>
+                <w:lang w:val="en-DK"/>
+              </w:rPr>
+              <w:t xml:space="preserve"> </w:t>
+            </w:r>
+            <w:r>
+              <w:rPr>
+                <w:rFonts w:ascii="Cambria" w:hAnsi="Cambria" w:cs="Cambria"/>
+                <w:lang w:val="en-DK"/>
+              </w:rPr>
+              <w:t> </w:t>
+            </w:r>
+            <w:r>
+              <w:rPr>
+                <w:rFonts w:ascii="Segoe MDL2 Assets" w:hAnsi="Segoe MDL2 Assets" w:cs="Times New Roman"/>
+                <w:lang w:val="en-DK"/>
+              </w:rPr>
+              <w:t xml:space="preserve"> </w:t>
+            </w:r>
+            <w:r>
+              <w:rPr>
+                <w:rFonts w:ascii="Cambria" w:hAnsi="Cambria" w:cs="Cambria"/>
+                <w:lang w:val="en-DK"/>
+              </w:rPr>
+              <w:t> </w:t>
+            </w:r>
+            <w:r>
+              <w:rPr>
+                <w:rFonts w:ascii="Segoe MDL2 Assets" w:hAnsi="Segoe MDL2 Assets" w:cs="Times New Roman"/>
+                <w:lang w:val="en-DK"/>
+              </w:rPr>
+              <w:t xml:space="preserve"> </w:t>
+            </w:r>
+            <w:r>
+              <w:rPr>
+                <w:rFonts w:ascii="Cambria" w:hAnsi="Cambria" w:cs="Cambria"/>
+                <w:lang w:val="en-DK"/>
+              </w:rPr>
+              <w:t> </w:t>
+            </w:r>
+            <w:r>
+              <w:rPr>
+                <w:rFonts w:ascii="Segoe MDL2 Assets" w:hAnsi="Segoe MDL2 Assets" w:cs="Times New Roman"/>
+                <w:lang w:val="en-DK"/>
+              </w:rPr>
+              <w:t xml:space="preserve"> </w:t>
+            </w:r>
+            <w:r>
+              <w:rPr>
+                <w:rFonts w:ascii="Cambria" w:hAnsi="Cambria" w:cs="Cambria"/>
+                <w:lang w:val="en-DK"/>
+              </w:rPr>
+              <w:t> </w:t>
+            </w:r>
+            <w:r>
+              <w:rPr>
+                <w:rFonts w:ascii="Segoe MDL2 Assets" w:hAnsi="Segoe MDL2 Assets" w:cs="Times New Roman"/>
+                <w:lang w:val="en-DK"/>
+              </w:rPr>
+              <w:t xml:space="preserve"> </w:t>
+            </w:r>
+            <w:r>
+              <w:rPr>
+                <w:rFonts w:ascii="Cambria" w:hAnsi="Cambria" w:cs="Cambria"/>
+                <w:lang w:val="en-DK"/>
+              </w:rPr>
+              <w:t> </w:t>
+            </w:r>
+            <w:r>
+              <w:rPr>
+                <w:rFonts w:ascii="Segoe MDL2 Assets" w:hAnsi="Segoe MDL2 Assets" w:cs="Times New Roman"/>
+                <w:lang w:val="en-DK"/>
+              </w:rPr>
+              <w:t xml:space="preserve"> </w:t>
+            </w:r>
+            <w:r>
+              <w:rPr>
+                <w:rFonts w:ascii="Cambria" w:hAnsi="Cambria" w:cs="Cambria"/>
+                <w:lang w:val="en-DK"/>
+              </w:rPr>
+              <w:t> </w:t>
+            </w:r>
+            <w:r>
+              <w:rPr>
+                <w:rFonts w:ascii="Segoe MDL2 Assets" w:hAnsi="Segoe MDL2 Assets" w:cs="Times New Roman"/>
+                <w:lang w:val="en-DK"/>
+              </w:rPr>
+              <w:t xml:space="preserve"> </w:t>
+            </w:r>
+            <w:r>
+              <w:rPr>
+                <w:rFonts w:ascii="Cambria" w:hAnsi="Cambria" w:cs="Cambria"/>
+                <w:lang w:val="en-DK"/>
+              </w:rPr>
+              <w:t> </w:t>
+            </w:r>
+            <w:r>
+              <w:rPr>
+                <w:rFonts w:ascii="Segoe MDL2 Assets" w:hAnsi="Segoe MDL2 Assets" w:cs="Times New Roman"/>
+                <w:lang w:val="en-DK"/>
+              </w:rPr>
+              <w:t xml:space="preserve"> if dist &lt; 1:</w:t>
+            </w:r>
+          </w:p>
+          <w:p>
+            <w:pPr>
+              <w:rPr>
+                <w:rFonts w:ascii="Segoe MDL2 Assets" w:hAnsi="Segoe MDL2 Assets" w:cs="Times New Roman"/>
+                <w:lang w:val="en-DK"/>
+              </w:rPr>
+            </w:pPr>
+            <w:r>
+              <w:rPr>
+                <w:rFonts w:ascii="Cambria" w:hAnsi="Cambria" w:cs="Cambria"/>
+                <w:lang w:val="en-DK"/>
+              </w:rPr>
+              <w:t> </w:t>
+            </w:r>
+            <w:r>
+              <w:rPr>
+                <w:rFonts w:ascii="Segoe MDL2 Assets" w:hAnsi="Segoe MDL2 Assets" w:cs="Times New Roman"/>
+                <w:lang w:val="en-DK"/>
+              </w:rPr>
+              <w:t xml:space="preserve"> </w:t>
+            </w:r>
+            <w:r>
+              <w:rPr>
+                <w:rFonts w:ascii="Cambria" w:hAnsi="Cambria" w:cs="Cambria"/>
+                <w:lang w:val="en-DK"/>
+              </w:rPr>
+              <w:t> </w:t>
+            </w:r>
+            <w:r>
+              <w:rPr>
+                <w:rFonts w:ascii="Segoe MDL2 Assets" w:hAnsi="Segoe MDL2 Assets" w:cs="Times New Roman"/>
+                <w:lang w:val="en-DK"/>
+              </w:rPr>
+              <w:t xml:space="preserve"> </w:t>
+            </w:r>
+            <w:r>
+              <w:rPr>
+                <w:rFonts w:ascii="Cambria" w:hAnsi="Cambria" w:cs="Cambria"/>
+                <w:lang w:val="en-DK"/>
+              </w:rPr>
+              <w:t> </w:t>
+            </w:r>
+            <w:r>
+              <w:rPr>
+                <w:rFonts w:ascii="Segoe MDL2 Assets" w:hAnsi="Segoe MDL2 Assets" w:cs="Times New Roman"/>
+                <w:lang w:val="en-DK"/>
+              </w:rPr>
+              <w:t xml:space="preserve"> </w:t>
+            </w:r>
+            <w:r>
+              <w:rPr>
+                <w:rFonts w:ascii="Cambria" w:hAnsi="Cambria" w:cs="Cambria"/>
+                <w:lang w:val="en-DK"/>
+              </w:rPr>
+              <w:t> </w:t>
+            </w:r>
+            <w:r>
+              <w:rPr>
+                <w:rFonts w:ascii="Segoe MDL2 Assets" w:hAnsi="Segoe MDL2 Assets" w:cs="Times New Roman"/>
+                <w:lang w:val="en-DK"/>
+              </w:rPr>
+              <w:t xml:space="preserve"> </w:t>
+            </w:r>
+            <w:r>
+              <w:rPr>
+                <w:rFonts w:ascii="Cambria" w:hAnsi="Cambria" w:cs="Cambria"/>
+                <w:lang w:val="en-DK"/>
+              </w:rPr>
+              <w:t> </w:t>
+            </w:r>
+            <w:r>
+              <w:rPr>
+                <w:rFonts w:ascii="Segoe MDL2 Assets" w:hAnsi="Segoe MDL2 Assets" w:cs="Times New Roman"/>
+                <w:lang w:val="en-DK"/>
+              </w:rPr>
+              <w:t xml:space="preserve"> </w:t>
+            </w:r>
+            <w:r>
+              <w:rPr>
+                <w:rFonts w:ascii="Cambria" w:hAnsi="Cambria" w:cs="Cambria"/>
+                <w:lang w:val="en-DK"/>
+              </w:rPr>
+              <w:t> </w:t>
+            </w:r>
+            <w:r>
+              <w:rPr>
+                <w:rFonts w:ascii="Segoe MDL2 Assets" w:hAnsi="Segoe MDL2 Assets" w:cs="Times New Roman"/>
+                <w:lang w:val="en-DK"/>
+              </w:rPr>
+              <w:t xml:space="preserve"> </w:t>
+            </w:r>
+            <w:r>
+              <w:rPr>
+                <w:rFonts w:ascii="Cambria" w:hAnsi="Cambria" w:cs="Cambria"/>
+                <w:lang w:val="en-DK"/>
+              </w:rPr>
+              <w:t> </w:t>
+            </w:r>
+            <w:r>
+              <w:rPr>
+                <w:rFonts w:ascii="Segoe MDL2 Assets" w:hAnsi="Segoe MDL2 Assets" w:cs="Times New Roman"/>
+                <w:lang w:val="en-DK"/>
+              </w:rPr>
+              <w:t xml:space="preserve"> </w:t>
+            </w:r>
+            <w:r>
+              <w:rPr>
+                <w:rFonts w:ascii="Cambria" w:hAnsi="Cambria" w:cs="Cambria"/>
+                <w:lang w:val="en-DK"/>
+              </w:rPr>
+              <w:t> </w:t>
+            </w:r>
+            <w:r>
+              <w:rPr>
+                <w:rFonts w:ascii="Segoe MDL2 Assets" w:hAnsi="Segoe MDL2 Assets" w:cs="Times New Roman"/>
+                <w:lang w:val="en-DK"/>
+              </w:rPr>
+              <w:t xml:space="preserve"> </w:t>
+            </w:r>
+            <w:r>
+              <w:rPr>
+                <w:rFonts w:ascii="Cambria" w:hAnsi="Cambria" w:cs="Cambria"/>
+                <w:lang w:val="en-DK"/>
+              </w:rPr>
+              <w:t> </w:t>
+            </w:r>
+            <w:r>
+              <w:rPr>
+                <w:rFonts w:ascii="Segoe MDL2 Assets" w:hAnsi="Segoe MDL2 Assets" w:cs="Times New Roman"/>
+                <w:lang w:val="en-DK"/>
+              </w:rPr>
+              <w:t xml:space="preserve"> </w:t>
+            </w:r>
+            <w:r>
+              <w:rPr>
+                <w:rFonts w:ascii="Cambria" w:hAnsi="Cambria" w:cs="Cambria"/>
+                <w:lang w:val="en-DK"/>
+              </w:rPr>
+              <w:t> </w:t>
+            </w:r>
+            <w:r>
+              <w:rPr>
+                <w:rFonts w:ascii="Segoe MDL2 Assets" w:hAnsi="Segoe MDL2 Assets" w:cs="Times New Roman"/>
+                <w:lang w:val="en-DK"/>
+              </w:rPr>
+              <w:t xml:space="preserve"> continue</w:t>
+            </w:r>
+          </w:p>
+          <w:p>
+            <w:pPr>
+              <w:rPr>
+                <w:rFonts w:ascii="Segoe MDL2 Assets" w:hAnsi="Segoe MDL2 Assets" w:cs="Times New Roman"/>
+                <w:lang w:val="en-DK"/>
+              </w:rPr>
+            </w:pPr>
+          </w:p>
+          <w:p>
+            <w:pPr>
+              <w:rPr>
+                <w:rFonts w:ascii="Segoe MDL2 Assets" w:hAnsi="Segoe MDL2 Assets" w:cs="Times New Roman"/>
+                <w:lang w:val="en-DK"/>
+              </w:rPr>
+            </w:pPr>
+            <w:r>
+              <w:rPr>
+                <w:rFonts w:ascii="Cambria" w:hAnsi="Cambria" w:cs="Cambria"/>
+                <w:lang w:val="en-DK"/>
+              </w:rPr>
+              <w:t> </w:t>
+            </w:r>
+            <w:r>
+              <w:rPr>
+                <w:rFonts w:ascii="Segoe MDL2 Assets" w:hAnsi="Segoe MDL2 Assets" w:cs="Times New Roman"/>
+                <w:lang w:val="en-DK"/>
+              </w:rPr>
+              <w:t xml:space="preserve"> </w:t>
+            </w:r>
+            <w:r>
+              <w:rPr>
+                <w:rFonts w:ascii="Cambria" w:hAnsi="Cambria" w:cs="Cambria"/>
+                <w:lang w:val="en-DK"/>
+              </w:rPr>
+              <w:t> </w:t>
+            </w:r>
+            <w:r>
+              <w:rPr>
+                <w:rFonts w:ascii="Segoe MDL2 Assets" w:hAnsi="Segoe MDL2 Assets" w:cs="Times New Roman"/>
+                <w:lang w:val="en-DK"/>
+              </w:rPr>
+              <w:t xml:space="preserve"> </w:t>
+            </w:r>
+            <w:r>
+              <w:rPr>
+                <w:rFonts w:ascii="Cambria" w:hAnsi="Cambria" w:cs="Cambria"/>
+                <w:lang w:val="en-DK"/>
+              </w:rPr>
+              <w:t> </w:t>
+            </w:r>
+            <w:r>
+              <w:rPr>
+                <w:rFonts w:ascii="Segoe MDL2 Assets" w:hAnsi="Segoe MDL2 Assets" w:cs="Times New Roman"/>
+                <w:lang w:val="en-DK"/>
+              </w:rPr>
+              <w:t xml:space="preserve"> </w:t>
+            </w:r>
+            <w:r>
+              <w:rPr>
+                <w:rFonts w:ascii="Cambria" w:hAnsi="Cambria" w:cs="Cambria"/>
+                <w:lang w:val="en-DK"/>
+              </w:rPr>
+              <w:t> </w:t>
+            </w:r>
+            <w:r>
+              <w:rPr>
+                <w:rFonts w:ascii="Segoe MDL2 Assets" w:hAnsi="Segoe MDL2 Assets" w:cs="Times New Roman"/>
+                <w:lang w:val="en-DK"/>
+              </w:rPr>
+              <w:t xml:space="preserve"> </w:t>
+            </w:r>
+            <w:r>
+              <w:rPr>
+                <w:rFonts w:ascii="Cambria" w:hAnsi="Cambria" w:cs="Cambria"/>
+                <w:lang w:val="en-DK"/>
+              </w:rPr>
+              <w:t> </w:t>
+            </w:r>
+            <w:r>
+              <w:rPr>
+                <w:rFonts w:ascii="Segoe MDL2 Assets" w:hAnsi="Segoe MDL2 Assets" w:cs="Times New Roman"/>
+                <w:lang w:val="en-DK"/>
+              </w:rPr>
+              <w:t xml:space="preserve"> </w:t>
+            </w:r>
+            <w:r>
+              <w:rPr>
+                <w:rFonts w:ascii="Cambria" w:hAnsi="Cambria" w:cs="Cambria"/>
+                <w:lang w:val="en-DK"/>
+              </w:rPr>
+              <w:t> </w:t>
+            </w:r>
+            <w:r>
+              <w:rPr>
+                <w:rFonts w:ascii="Segoe MDL2 Assets" w:hAnsi="Segoe MDL2 Assets" w:cs="Times New Roman"/>
+                <w:lang w:val="en-DK"/>
+              </w:rPr>
+              <w:t xml:space="preserve"> </w:t>
+            </w:r>
+            <w:r>
+              <w:rPr>
+                <w:rFonts w:ascii="Cambria" w:hAnsi="Cambria" w:cs="Cambria"/>
+                <w:lang w:val="en-DK"/>
+              </w:rPr>
+              <w:t> </w:t>
+            </w:r>
+            <w:r>
+              <w:rPr>
+                <w:rFonts w:ascii="Segoe MDL2 Assets" w:hAnsi="Segoe MDL2 Assets" w:cs="Times New Roman"/>
+                <w:lang w:val="en-DK"/>
+              </w:rPr>
+              <w:t xml:space="preserve"> </w:t>
+            </w:r>
+            <w:r>
+              <w:rPr>
+                <w:rFonts w:ascii="Cambria" w:hAnsi="Cambria" w:cs="Cambria"/>
+                <w:lang w:val="en-DK"/>
+              </w:rPr>
+              <w:t> </w:t>
+            </w:r>
+            <w:r>
+              <w:rPr>
+                <w:rFonts w:ascii="Segoe MDL2 Assets" w:hAnsi="Segoe MDL2 Assets" w:cs="Times New Roman"/>
+                <w:lang w:val="en-DK"/>
+              </w:rPr>
+              <w:t xml:space="preserve"> </w:t>
+            </w:r>
+            <w:proofErr w:type="spellStart"/>
+            <w:r>
+              <w:rPr>
+                <w:rFonts w:ascii="Segoe MDL2 Assets" w:hAnsi="Segoe MDL2 Assets" w:cs="Times New Roman"/>
+                <w:lang w:val="en-DK"/>
+              </w:rPr>
+              <w:t>ax</w:t>
+            </w:r>
+            <w:proofErr w:type="spellEnd"/>
+            <w:r>
+              <w:rPr>
+                <w:rFonts w:ascii="Segoe MDL2 Assets" w:hAnsi="Segoe MDL2 Assets" w:cs="Times New Roman"/>
+                <w:lang w:val="en-DK"/>
+              </w:rPr>
+              <w:t xml:space="preserve"> += </w:t>
+            </w:r>
+            <w:proofErr w:type="spellStart"/>
+            <w:r>
+              <w:rPr>
+                <w:rFonts w:ascii="Segoe MDL2 Assets" w:hAnsi="Segoe MDL2 Assets" w:cs="Times New Roman"/>
+                <w:lang w:val="en-DK"/>
+              </w:rPr>
+              <w:t>self.G</w:t>
+            </w:r>
+            <w:proofErr w:type="spellEnd"/>
+            <w:r>
+              <w:rPr>
+                <w:rFonts w:ascii="Segoe MDL2 Assets" w:hAnsi="Segoe MDL2 Assets" w:cs="Times New Roman"/>
+                <w:lang w:val="en-DK"/>
+              </w:rPr>
+              <w:t xml:space="preserve"> * MASS * dx / dist**3</w:t>
+            </w:r>
+          </w:p>
+          <w:p>
+            <w:pPr>
+              <w:rPr>
+                <w:rFonts w:ascii="Segoe MDL2 Assets" w:hAnsi="Segoe MDL2 Assets" w:cs="Times New Roman"/>
+                <w:lang w:val="en-DK"/>
+              </w:rPr>
+            </w:pPr>
+            <w:r>
+              <w:rPr>
+                <w:rFonts w:ascii="Cambria" w:hAnsi="Cambria" w:cs="Cambria"/>
+                <w:lang w:val="en-DK"/>
+              </w:rPr>
+              <w:t> </w:t>
+            </w:r>
+            <w:r>
+              <w:rPr>
+                <w:rFonts w:ascii="Segoe MDL2 Assets" w:hAnsi="Segoe MDL2 Assets" w:cs="Times New Roman"/>
+                <w:lang w:val="en-DK"/>
+              </w:rPr>
+              <w:t xml:space="preserve"> </w:t>
+            </w:r>
+            <w:r>
+              <w:rPr>
+                <w:rFonts w:ascii="Cambria" w:hAnsi="Cambria" w:cs="Cambria"/>
+                <w:lang w:val="en-DK"/>
+              </w:rPr>
+              <w:t> </w:t>
+            </w:r>
+            <w:r>
+              <w:rPr>
+                <w:rFonts w:ascii="Segoe MDL2 Assets" w:hAnsi="Segoe MDL2 Assets" w:cs="Times New Roman"/>
+                <w:lang w:val="en-DK"/>
+              </w:rPr>
+              <w:t xml:space="preserve"> </w:t>
+            </w:r>
+            <w:r>
+              <w:rPr>
+                <w:rFonts w:ascii="Cambria" w:hAnsi="Cambria" w:cs="Cambria"/>
+                <w:lang w:val="en-DK"/>
+              </w:rPr>
+              <w:t> </w:t>
+            </w:r>
+            <w:r>
+              <w:rPr>
+                <w:rFonts w:ascii="Segoe MDL2 Assets" w:hAnsi="Segoe MDL2 Assets" w:cs="Times New Roman"/>
+                <w:lang w:val="en-DK"/>
+              </w:rPr>
+              <w:t xml:space="preserve"> </w:t>
+            </w:r>
+            <w:r>
+              <w:rPr>
+                <w:rFonts w:ascii="Cambria" w:hAnsi="Cambria" w:cs="Cambria"/>
+                <w:lang w:val="en-DK"/>
+              </w:rPr>
+              <w:t> </w:t>
+            </w:r>
+            <w:r>
+              <w:rPr>
+                <w:rFonts w:ascii="Segoe MDL2 Assets" w:hAnsi="Segoe MDL2 Assets" w:cs="Times New Roman"/>
+                <w:lang w:val="en-DK"/>
+              </w:rPr>
+              <w:t xml:space="preserve"> </w:t>
+            </w:r>
+            <w:r>
+              <w:rPr>
+                <w:rFonts w:ascii="Cambria" w:hAnsi="Cambria" w:cs="Cambria"/>
+                <w:lang w:val="en-DK"/>
+              </w:rPr>
+              <w:t> </w:t>
+            </w:r>
+            <w:r>
+              <w:rPr>
+                <w:rFonts w:ascii="Segoe MDL2 Assets" w:hAnsi="Segoe MDL2 Assets" w:cs="Times New Roman"/>
+                <w:lang w:val="en-DK"/>
+              </w:rPr>
+              <w:t xml:space="preserve"> </w:t>
+            </w:r>
+            <w:r>
+              <w:rPr>
+                <w:rFonts w:ascii="Cambria" w:hAnsi="Cambria" w:cs="Cambria"/>
+                <w:lang w:val="en-DK"/>
+              </w:rPr>
+              <w:t> </w:t>
+            </w:r>
+            <w:r>
+              <w:rPr>
+                <w:rFonts w:ascii="Segoe MDL2 Assets" w:hAnsi="Segoe MDL2 Assets" w:cs="Times New Roman"/>
+                <w:lang w:val="en-DK"/>
+              </w:rPr>
+              <w:t xml:space="preserve"> </w:t>
+            </w:r>
+            <w:r>
+              <w:rPr>
+                <w:rFonts w:ascii="Cambria" w:hAnsi="Cambria" w:cs="Cambria"/>
+                <w:lang w:val="en-DK"/>
+              </w:rPr>
+              <w:t> </w:t>
+            </w:r>
+            <w:r>
+              <w:rPr>
+                <w:rFonts w:ascii="Segoe MDL2 Assets" w:hAnsi="Segoe MDL2 Assets" w:cs="Times New Roman"/>
+                <w:lang w:val="en-DK"/>
+              </w:rPr>
+              <w:t xml:space="preserve"> </w:t>
+            </w:r>
+            <w:r>
+              <w:rPr>
+                <w:rFonts w:ascii="Cambria" w:hAnsi="Cambria" w:cs="Cambria"/>
+                <w:lang w:val="en-DK"/>
+              </w:rPr>
+              <w:t> </w:t>
+            </w:r>
+            <w:r>
+              <w:rPr>
+                <w:rFonts w:ascii="Segoe MDL2 Assets" w:hAnsi="Segoe MDL2 Assets" w:cs="Times New Roman"/>
+                <w:lang w:val="en-DK"/>
+              </w:rPr>
+              <w:t xml:space="preserve"> ay += </w:t>
+            </w:r>
+            <w:proofErr w:type="spellStart"/>
+            <w:r>
+              <w:rPr>
+                <w:rFonts w:ascii="Segoe MDL2 Assets" w:hAnsi="Segoe MDL2 Assets" w:cs="Times New Roman"/>
+                <w:lang w:val="en-DK"/>
+              </w:rPr>
+              <w:t>self.G</w:t>
+            </w:r>
+            <w:proofErr w:type="spellEnd"/>
+            <w:r>
+              <w:rPr>
+                <w:rFonts w:ascii="Segoe MDL2 Assets" w:hAnsi="Segoe MDL2 Assets" w:cs="Times New Roman"/>
+                <w:lang w:val="en-DK"/>
+              </w:rPr>
+              <w:t xml:space="preserve"> * MASS * </w:t>
+            </w:r>
+            <w:proofErr w:type="spellStart"/>
+            <w:r>
+              <w:rPr>
+                <w:rFonts w:ascii="Segoe MDL2 Assets" w:hAnsi="Segoe MDL2 Assets" w:cs="Times New Roman"/>
+                <w:lang w:val="en-DK"/>
+              </w:rPr>
+              <w:t>dy</w:t>
+            </w:r>
+            <w:proofErr w:type="spellEnd"/>
+            <w:r>
+              <w:rPr>
+                <w:rFonts w:ascii="Segoe MDL2 Assets" w:hAnsi="Segoe MDL2 Assets" w:cs="Times New Roman"/>
+                <w:lang w:val="en-DK"/>
+              </w:rPr>
+              <w:t xml:space="preserve"> / dist**3</w:t>
+            </w:r>
+          </w:p>
+          <w:p>
+            <w:pPr>
+              <w:rPr>
+                <w:rFonts w:ascii="Segoe MDL2 Assets" w:hAnsi="Segoe MDL2 Assets" w:cs="Times New Roman"/>
+                <w:lang w:val="en-DK"/>
+              </w:rPr>
+            </w:pPr>
+          </w:p>
+          <w:p>
+            <w:pPr>
+              <w:rPr>
+                <w:rFonts w:ascii="Segoe MDL2 Assets" w:hAnsi="Segoe MDL2 Assets" w:cs="Times New Roman"/>
+                <w:lang w:val="en-DK"/>
+              </w:rPr>
+            </w:pPr>
+            <w:r>
+              <w:rPr>
+                <w:rFonts w:ascii="Cambria" w:hAnsi="Cambria" w:cs="Cambria"/>
+                <w:lang w:val="en-DK"/>
+              </w:rPr>
+              <w:t> </w:t>
+            </w:r>
+            <w:r>
+              <w:rPr>
+                <w:rFonts w:ascii="Segoe MDL2 Assets" w:hAnsi="Segoe MDL2 Assets" w:cs="Times New Roman"/>
+                <w:lang w:val="en-DK"/>
+              </w:rPr>
+              <w:t xml:space="preserve"> </w:t>
+            </w:r>
+            <w:r>
+              <w:rPr>
+                <w:rFonts w:ascii="Cambria" w:hAnsi="Cambria" w:cs="Cambria"/>
+                <w:lang w:val="en-DK"/>
+              </w:rPr>
+              <w:t> </w:t>
+            </w:r>
+            <w:r>
+              <w:rPr>
+                <w:rFonts w:ascii="Segoe MDL2 Assets" w:hAnsi="Segoe MDL2 Assets" w:cs="Times New Roman"/>
+                <w:lang w:val="en-DK"/>
+              </w:rPr>
+              <w:t xml:space="preserve"> </w:t>
+            </w:r>
+            <w:r>
+              <w:rPr>
+                <w:rFonts w:ascii="Cambria" w:hAnsi="Cambria" w:cs="Cambria"/>
+                <w:lang w:val="en-DK"/>
+              </w:rPr>
+              <w:t> </w:t>
+            </w:r>
+            <w:r>
+              <w:rPr>
+                <w:rFonts w:ascii="Segoe MDL2 Assets" w:hAnsi="Segoe MDL2 Assets" w:cs="Times New Roman"/>
+                <w:lang w:val="en-DK"/>
+              </w:rPr>
+              <w:t xml:space="preserve"> </w:t>
+            </w:r>
+            <w:r>
+              <w:rPr>
+                <w:rFonts w:ascii="Cambria" w:hAnsi="Cambria" w:cs="Cambria"/>
+                <w:lang w:val="en-DK"/>
+              </w:rPr>
+              <w:t> </w:t>
+            </w:r>
+            <w:r>
+              <w:rPr>
+                <w:rFonts w:ascii="Segoe MDL2 Assets" w:hAnsi="Segoe MDL2 Assets" w:cs="Times New Roman"/>
+                <w:lang w:val="en-DK"/>
+              </w:rPr>
+              <w:t xml:space="preserve"> </w:t>
+            </w:r>
+            <w:r>
+              <w:rPr>
+                <w:rFonts w:ascii="Cambria" w:hAnsi="Cambria" w:cs="Cambria"/>
+                <w:lang w:val="en-DK"/>
+              </w:rPr>
+              <w:t> </w:t>
+            </w:r>
+            <w:r>
+              <w:rPr>
+                <w:rFonts w:ascii="Segoe MDL2 Assets" w:hAnsi="Segoe MDL2 Assets" w:cs="Times New Roman"/>
+                <w:lang w:val="en-DK"/>
+              </w:rPr>
+              <w:t xml:space="preserve"> </w:t>
+            </w:r>
+            <w:r>
+              <w:rPr>
+                <w:rFonts w:ascii="Cambria" w:hAnsi="Cambria" w:cs="Cambria"/>
+                <w:lang w:val="en-DK"/>
+              </w:rPr>
+              <w:t> </w:t>
+            </w:r>
+            <w:r>
+              <w:rPr>
+                <w:rFonts w:ascii="Segoe MDL2 Assets" w:hAnsi="Segoe MDL2 Assets" w:cs="Times New Roman"/>
+                <w:lang w:val="en-DK"/>
+              </w:rPr>
+              <w:t xml:space="preserve"> VELOCITY[0] += </w:t>
+            </w:r>
+            <w:proofErr w:type="spellStart"/>
+            <w:r>
+              <w:rPr>
+                <w:rFonts w:ascii="Segoe MDL2 Assets" w:hAnsi="Segoe MDL2 Assets" w:cs="Times New Roman"/>
+                <w:lang w:val="en-DK"/>
+              </w:rPr>
+              <w:t>ax</w:t>
+            </w:r>
+            <w:proofErr w:type="spellEnd"/>
+          </w:p>
+          <w:p>
+            <w:pPr>
+              <w:rPr>
+                <w:rFonts w:ascii="Segoe MDL2 Assets" w:hAnsi="Segoe MDL2 Assets" w:cs="Times New Roman"/>
+                <w:lang w:val="en-DK"/>
+              </w:rPr>
+            </w:pPr>
+            <w:r>
+              <w:rPr>
+                <w:rFonts w:ascii="Cambria" w:hAnsi="Cambria" w:cs="Cambria"/>
+                <w:lang w:val="en-DK"/>
+              </w:rPr>
+              <w:t> </w:t>
+            </w:r>
+            <w:r>
+              <w:rPr>
+                <w:rFonts w:ascii="Segoe MDL2 Assets" w:hAnsi="Segoe MDL2 Assets" w:cs="Times New Roman"/>
+                <w:lang w:val="en-DK"/>
+              </w:rPr>
+              <w:t xml:space="preserve"> </w:t>
+            </w:r>
+            <w:r>
+              <w:rPr>
+                <w:rFonts w:ascii="Cambria" w:hAnsi="Cambria" w:cs="Cambria"/>
+                <w:lang w:val="en-DK"/>
+              </w:rPr>
+              <w:t> </w:t>
+            </w:r>
+            <w:r>
+              <w:rPr>
+                <w:rFonts w:ascii="Segoe MDL2 Assets" w:hAnsi="Segoe MDL2 Assets" w:cs="Times New Roman"/>
+                <w:lang w:val="en-DK"/>
+              </w:rPr>
+              <w:t xml:space="preserve"> </w:t>
+            </w:r>
+            <w:r>
+              <w:rPr>
+                <w:rFonts w:ascii="Cambria" w:hAnsi="Cambria" w:cs="Cambria"/>
+                <w:lang w:val="en-DK"/>
+              </w:rPr>
+              <w:t> </w:t>
+            </w:r>
+            <w:r>
+              <w:rPr>
+                <w:rFonts w:ascii="Segoe MDL2 Assets" w:hAnsi="Segoe MDL2 Assets" w:cs="Times New Roman"/>
+                <w:lang w:val="en-DK"/>
+              </w:rPr>
+              <w:t xml:space="preserve"> </w:t>
+            </w:r>
+            <w:r>
+              <w:rPr>
+                <w:rFonts w:ascii="Cambria" w:hAnsi="Cambria" w:cs="Cambria"/>
+                <w:lang w:val="en-DK"/>
+              </w:rPr>
+              <w:t> </w:t>
+            </w:r>
+            <w:r>
+              <w:rPr>
+                <w:rFonts w:ascii="Segoe MDL2 Assets" w:hAnsi="Segoe MDL2 Assets" w:cs="Times New Roman"/>
+                <w:lang w:val="en-DK"/>
+              </w:rPr>
+              <w:t xml:space="preserve"> </w:t>
+            </w:r>
+            <w:r>
+              <w:rPr>
+                <w:rFonts w:ascii="Cambria" w:hAnsi="Cambria" w:cs="Cambria"/>
+                <w:lang w:val="en-DK"/>
+              </w:rPr>
+              <w:t> </w:t>
+            </w:r>
+            <w:r>
+              <w:rPr>
+                <w:rFonts w:ascii="Segoe MDL2 Assets" w:hAnsi="Segoe MDL2 Assets" w:cs="Times New Roman"/>
+                <w:lang w:val="en-DK"/>
+              </w:rPr>
+              <w:t xml:space="preserve"> </w:t>
+            </w:r>
+            <w:r>
+              <w:rPr>
+                <w:rFonts w:ascii="Cambria" w:hAnsi="Cambria" w:cs="Cambria"/>
+                <w:lang w:val="en-DK"/>
+              </w:rPr>
+              <w:t> </w:t>
+            </w:r>
+            <w:r>
+              <w:rPr>
+                <w:rFonts w:ascii="Segoe MDL2 Assets" w:hAnsi="Segoe MDL2 Assets" w:cs="Times New Roman"/>
+                <w:lang w:val="en-DK"/>
+              </w:rPr>
+              <w:t xml:space="preserve"> VELOCITY[1] += ay</w:t>
+            </w:r>
+          </w:p>
+          <w:p>
+            <w:pPr>
+              <w:rPr>
+                <w:rFonts w:ascii="Segoe MDL2 Assets" w:hAnsi="Segoe MDL2 Assets" w:cs="Times New Roman"/>
+                <w:lang w:val="en-DK"/>
+              </w:rPr>
+            </w:pPr>
+          </w:p>
+          <w:p>
+            <w:pPr>
+              <w:rPr>
+                <w:rFonts w:ascii="Segoe MDL2 Assets" w:hAnsi="Segoe MDL2 Assets" w:cs="Times New Roman"/>
+                <w:lang w:val="en-DK"/>
+              </w:rPr>
+            </w:pPr>
+            <w:r>
+              <w:rPr>
+                <w:rFonts w:ascii="Cambria" w:hAnsi="Cambria" w:cs="Cambria"/>
+                <w:lang w:val="en-DK"/>
+              </w:rPr>
+              <w:lastRenderedPageBreak/>
+              <w:t> </w:t>
+            </w:r>
+            <w:r>
+              <w:rPr>
+                <w:rFonts w:ascii="Segoe MDL2 Assets" w:hAnsi="Segoe MDL2 Assets" w:cs="Times New Roman"/>
+                <w:lang w:val="en-DK"/>
+              </w:rPr>
+              <w:t xml:space="preserve"> </w:t>
+            </w:r>
+            <w:r>
+              <w:rPr>
+                <w:rFonts w:ascii="Cambria" w:hAnsi="Cambria" w:cs="Cambria"/>
+                <w:lang w:val="en-DK"/>
+              </w:rPr>
+              <w:t> </w:t>
+            </w:r>
+            <w:r>
+              <w:rPr>
+                <w:rFonts w:ascii="Segoe MDL2 Assets" w:hAnsi="Segoe MDL2 Assets" w:cs="Times New Roman"/>
+                <w:lang w:val="en-DK"/>
+              </w:rPr>
+              <w:t xml:space="preserve"> </w:t>
+            </w:r>
+            <w:r>
+              <w:rPr>
+                <w:rFonts w:ascii="Cambria" w:hAnsi="Cambria" w:cs="Cambria"/>
+                <w:lang w:val="en-DK"/>
+              </w:rPr>
+              <w:t> </w:t>
+            </w:r>
+            <w:r>
+              <w:rPr>
+                <w:rFonts w:ascii="Segoe MDL2 Assets" w:hAnsi="Segoe MDL2 Assets" w:cs="Times New Roman"/>
+                <w:lang w:val="en-DK"/>
+              </w:rPr>
+              <w:t xml:space="preserve"> </w:t>
+            </w:r>
+            <w:r>
+              <w:rPr>
+                <w:rFonts w:ascii="Cambria" w:hAnsi="Cambria" w:cs="Cambria"/>
+                <w:lang w:val="en-DK"/>
+              </w:rPr>
+              <w:t> </w:t>
+            </w:r>
+            <w:r>
+              <w:rPr>
+                <w:rFonts w:ascii="Segoe MDL2 Assets" w:hAnsi="Segoe MDL2 Assets" w:cs="Times New Roman"/>
+                <w:lang w:val="en-DK"/>
+              </w:rPr>
+              <w:t xml:space="preserve"> </w:t>
+            </w:r>
+            <w:r>
+              <w:rPr>
+                <w:rFonts w:ascii="Cambria" w:hAnsi="Cambria" w:cs="Cambria"/>
+                <w:lang w:val="en-DK"/>
+              </w:rPr>
+              <w:t> </w:t>
+            </w:r>
+            <w:r>
+              <w:rPr>
+                <w:rFonts w:ascii="Segoe MDL2 Assets" w:hAnsi="Segoe MDL2 Assets" w:cs="Times New Roman"/>
+                <w:lang w:val="en-DK"/>
+              </w:rPr>
+              <w:t xml:space="preserve"> </w:t>
+            </w:r>
+            <w:r>
+              <w:rPr>
+                <w:rFonts w:ascii="Cambria" w:hAnsi="Cambria" w:cs="Cambria"/>
+                <w:lang w:val="en-DK"/>
+              </w:rPr>
+              <w:t> </w:t>
+            </w:r>
+            <w:r>
+              <w:rPr>
+                <w:rFonts w:ascii="Segoe MDL2 Assets" w:hAnsi="Segoe MDL2 Assets" w:cs="Times New Roman"/>
+                <w:lang w:val="en-DK"/>
+              </w:rPr>
+              <w:t xml:space="preserve"> body1.updatePos(</w:t>
+            </w:r>
+          </w:p>
+          <w:p>
+            <w:pPr>
+              <w:rPr>
+                <w:rFonts w:ascii="Segoe MDL2 Assets" w:hAnsi="Segoe MDL2 Assets" w:cs="Times New Roman"/>
+                <w:lang w:val="en-DK"/>
+              </w:rPr>
+            </w:pPr>
+            <w:r>
+              <w:rPr>
+                <w:rFonts w:ascii="Cambria" w:hAnsi="Cambria" w:cs="Cambria"/>
+                <w:lang w:val="en-DK"/>
+              </w:rPr>
+              <w:t> </w:t>
+            </w:r>
+            <w:r>
+              <w:rPr>
+                <w:rFonts w:ascii="Segoe MDL2 Assets" w:hAnsi="Segoe MDL2 Assets" w:cs="Times New Roman"/>
+                <w:lang w:val="en-DK"/>
+              </w:rPr>
+              <w:t xml:space="preserve"> </w:t>
+            </w:r>
+            <w:r>
+              <w:rPr>
+                <w:rFonts w:ascii="Cambria" w:hAnsi="Cambria" w:cs="Cambria"/>
+                <w:lang w:val="en-DK"/>
+              </w:rPr>
+              <w:t> </w:t>
+            </w:r>
+            <w:r>
+              <w:rPr>
+                <w:rFonts w:ascii="Segoe MDL2 Assets" w:hAnsi="Segoe MDL2 Assets" w:cs="Times New Roman"/>
+                <w:lang w:val="en-DK"/>
+              </w:rPr>
+              <w:t xml:space="preserve"> </w:t>
+            </w:r>
+            <w:r>
+              <w:rPr>
+                <w:rFonts w:ascii="Cambria" w:hAnsi="Cambria" w:cs="Cambria"/>
+                <w:lang w:val="en-DK"/>
+              </w:rPr>
+              <w:t> </w:t>
+            </w:r>
+            <w:r>
+              <w:rPr>
+                <w:rFonts w:ascii="Segoe MDL2 Assets" w:hAnsi="Segoe MDL2 Assets" w:cs="Times New Roman"/>
+                <w:lang w:val="en-DK"/>
+              </w:rPr>
+              <w:t xml:space="preserve"> </w:t>
+            </w:r>
+            <w:r>
+              <w:rPr>
+                <w:rFonts w:ascii="Cambria" w:hAnsi="Cambria" w:cs="Cambria"/>
+                <w:lang w:val="en-DK"/>
+              </w:rPr>
+              <w:t> </w:t>
+            </w:r>
+            <w:r>
+              <w:rPr>
+                <w:rFonts w:ascii="Segoe MDL2 Assets" w:hAnsi="Segoe MDL2 Assets" w:cs="Times New Roman"/>
+                <w:lang w:val="en-DK"/>
+              </w:rPr>
+              <w:t xml:space="preserve"> </w:t>
+            </w:r>
+            <w:r>
+              <w:rPr>
+                <w:rFonts w:ascii="Cambria" w:hAnsi="Cambria" w:cs="Cambria"/>
+                <w:lang w:val="en-DK"/>
+              </w:rPr>
+              <w:t> </w:t>
+            </w:r>
+            <w:r>
+              <w:rPr>
+                <w:rFonts w:ascii="Segoe MDL2 Assets" w:hAnsi="Segoe MDL2 Assets" w:cs="Times New Roman"/>
+                <w:lang w:val="en-DK"/>
+              </w:rPr>
+              <w:t xml:space="preserve"> </w:t>
+            </w:r>
+            <w:r>
+              <w:rPr>
+                <w:rFonts w:ascii="Cambria" w:hAnsi="Cambria" w:cs="Cambria"/>
+                <w:lang w:val="en-DK"/>
+              </w:rPr>
+              <w:t> </w:t>
+            </w:r>
+            <w:r>
+              <w:rPr>
+                <w:rFonts w:ascii="Segoe MDL2 Assets" w:hAnsi="Segoe MDL2 Assets" w:cs="Times New Roman"/>
+                <w:lang w:val="en-DK"/>
+              </w:rPr>
+              <w:t xml:space="preserve"> </w:t>
+            </w:r>
+            <w:r>
+              <w:rPr>
+                <w:rFonts w:ascii="Cambria" w:hAnsi="Cambria" w:cs="Cambria"/>
+                <w:lang w:val="en-DK"/>
+              </w:rPr>
+              <w:t> </w:t>
+            </w:r>
+            <w:r>
+              <w:rPr>
+                <w:rFonts w:ascii="Segoe MDL2 Assets" w:hAnsi="Segoe MDL2 Assets" w:cs="Times New Roman"/>
+                <w:lang w:val="en-DK"/>
+              </w:rPr>
+              <w:t xml:space="preserve"> </w:t>
+            </w:r>
+            <w:r>
+              <w:rPr>
+                <w:rFonts w:ascii="Cambria" w:hAnsi="Cambria" w:cs="Cambria"/>
+                <w:lang w:val="en-DK"/>
+              </w:rPr>
+              <w:t> </w:t>
+            </w:r>
+            <w:r>
+              <w:rPr>
+                <w:rFonts w:ascii="Segoe MDL2 Assets" w:hAnsi="Segoe MDL2 Assets" w:cs="Times New Roman"/>
+                <w:lang w:val="en-DK"/>
+              </w:rPr>
+              <w:t xml:space="preserve"> VELOCITY[0] * </w:t>
+            </w:r>
+            <w:proofErr w:type="spellStart"/>
+            <w:r>
+              <w:rPr>
+                <w:rFonts w:ascii="Segoe MDL2 Assets" w:hAnsi="Segoe MDL2 Assets" w:cs="Times New Roman"/>
+                <w:lang w:val="en-DK"/>
+              </w:rPr>
+              <w:t>self.dt</w:t>
+            </w:r>
+            <w:proofErr w:type="spellEnd"/>
+            <w:r>
+              <w:rPr>
+                <w:rFonts w:ascii="Segoe MDL2 Assets" w:hAnsi="Segoe MDL2 Assets" w:cs="Times New Roman"/>
+                <w:lang w:val="en-DK"/>
+              </w:rPr>
+              <w:t>,</w:t>
+            </w:r>
+          </w:p>
+          <w:p>
+            <w:pPr>
+              <w:rPr>
+                <w:rFonts w:ascii="Segoe MDL2 Assets" w:hAnsi="Segoe MDL2 Assets" w:cs="Times New Roman"/>
+                <w:lang w:val="en-DK"/>
+              </w:rPr>
+            </w:pPr>
+            <w:r>
+              <w:rPr>
+                <w:rFonts w:ascii="Cambria" w:hAnsi="Cambria" w:cs="Cambria"/>
+                <w:lang w:val="en-DK"/>
+              </w:rPr>
+              <w:t> </w:t>
+            </w:r>
+            <w:r>
+              <w:rPr>
+                <w:rFonts w:ascii="Segoe MDL2 Assets" w:hAnsi="Segoe MDL2 Assets" w:cs="Times New Roman"/>
+                <w:lang w:val="en-DK"/>
+              </w:rPr>
+              <w:t xml:space="preserve"> </w:t>
+            </w:r>
+            <w:r>
+              <w:rPr>
+                <w:rFonts w:ascii="Cambria" w:hAnsi="Cambria" w:cs="Cambria"/>
+                <w:lang w:val="en-DK"/>
+              </w:rPr>
+              <w:t> </w:t>
+            </w:r>
+            <w:r>
+              <w:rPr>
+                <w:rFonts w:ascii="Segoe MDL2 Assets" w:hAnsi="Segoe MDL2 Assets" w:cs="Times New Roman"/>
+                <w:lang w:val="en-DK"/>
+              </w:rPr>
+              <w:t xml:space="preserve"> </w:t>
+            </w:r>
+            <w:r>
+              <w:rPr>
+                <w:rFonts w:ascii="Cambria" w:hAnsi="Cambria" w:cs="Cambria"/>
+                <w:lang w:val="en-DK"/>
+              </w:rPr>
+              <w:t> </w:t>
+            </w:r>
+            <w:r>
+              <w:rPr>
+                <w:rFonts w:ascii="Segoe MDL2 Assets" w:hAnsi="Segoe MDL2 Assets" w:cs="Times New Roman"/>
+                <w:lang w:val="en-DK"/>
+              </w:rPr>
+              <w:t xml:space="preserve"> </w:t>
+            </w:r>
+            <w:r>
+              <w:rPr>
+                <w:rFonts w:ascii="Cambria" w:hAnsi="Cambria" w:cs="Cambria"/>
+                <w:lang w:val="en-DK"/>
+              </w:rPr>
+              <w:t> </w:t>
+            </w:r>
+            <w:r>
+              <w:rPr>
+                <w:rFonts w:ascii="Segoe MDL2 Assets" w:hAnsi="Segoe MDL2 Assets" w:cs="Times New Roman"/>
+                <w:lang w:val="en-DK"/>
+              </w:rPr>
+              <w:t xml:space="preserve"> </w:t>
+            </w:r>
+            <w:r>
+              <w:rPr>
+                <w:rFonts w:ascii="Cambria" w:hAnsi="Cambria" w:cs="Cambria"/>
+                <w:lang w:val="en-DK"/>
+              </w:rPr>
+              <w:t> </w:t>
+            </w:r>
+            <w:r>
+              <w:rPr>
+                <w:rFonts w:ascii="Segoe MDL2 Assets" w:hAnsi="Segoe MDL2 Assets" w:cs="Times New Roman"/>
+                <w:lang w:val="en-DK"/>
+              </w:rPr>
+              <w:t xml:space="preserve"> </w:t>
+            </w:r>
+            <w:r>
+              <w:rPr>
+                <w:rFonts w:ascii="Cambria" w:hAnsi="Cambria" w:cs="Cambria"/>
+                <w:lang w:val="en-DK"/>
+              </w:rPr>
+              <w:t> </w:t>
+            </w:r>
+            <w:r>
+              <w:rPr>
+                <w:rFonts w:ascii="Segoe MDL2 Assets" w:hAnsi="Segoe MDL2 Assets" w:cs="Times New Roman"/>
+                <w:lang w:val="en-DK"/>
+              </w:rPr>
+              <w:t xml:space="preserve"> </w:t>
+            </w:r>
+            <w:r>
+              <w:rPr>
+                <w:rFonts w:ascii="Cambria" w:hAnsi="Cambria" w:cs="Cambria"/>
+                <w:lang w:val="en-DK"/>
+              </w:rPr>
+              <w:t> </w:t>
+            </w:r>
+            <w:r>
+              <w:rPr>
+                <w:rFonts w:ascii="Segoe MDL2 Assets" w:hAnsi="Segoe MDL2 Assets" w:cs="Times New Roman"/>
+                <w:lang w:val="en-DK"/>
+              </w:rPr>
+              <w:t xml:space="preserve"> </w:t>
+            </w:r>
+            <w:r>
+              <w:rPr>
+                <w:rFonts w:ascii="Cambria" w:hAnsi="Cambria" w:cs="Cambria"/>
+                <w:lang w:val="en-DK"/>
+              </w:rPr>
+              <w:t> </w:t>
+            </w:r>
+            <w:r>
+              <w:rPr>
+                <w:rFonts w:ascii="Segoe MDL2 Assets" w:hAnsi="Segoe MDL2 Assets" w:cs="Times New Roman"/>
+                <w:lang w:val="en-DK"/>
+              </w:rPr>
+              <w:t xml:space="preserve"> VELOCITY[1] * </w:t>
+            </w:r>
+            <w:proofErr w:type="spellStart"/>
+            <w:r>
+              <w:rPr>
+                <w:rFonts w:ascii="Segoe MDL2 Assets" w:hAnsi="Segoe MDL2 Assets" w:cs="Times New Roman"/>
+                <w:lang w:val="en-DK"/>
+              </w:rPr>
+              <w:t>self.dt</w:t>
+            </w:r>
+            <w:proofErr w:type="spellEnd"/>
+          </w:p>
+          <w:p>
+            <w:pPr>
+              <w:rPr>
+                <w:rFonts w:ascii="Segoe MDL2 Assets" w:hAnsi="Segoe MDL2 Assets" w:cs="Times New Roman"/>
+                <w:lang w:val="en-DK"/>
+              </w:rPr>
+            </w:pPr>
+            <w:r>
+              <w:rPr>
+                <w:rFonts w:ascii="Cambria" w:hAnsi="Cambria" w:cs="Cambria"/>
+                <w:lang w:val="en-DK"/>
+              </w:rPr>
+              <w:t> </w:t>
+            </w:r>
+            <w:r>
+              <w:rPr>
+                <w:rFonts w:ascii="Segoe MDL2 Assets" w:hAnsi="Segoe MDL2 Assets" w:cs="Times New Roman"/>
+                <w:lang w:val="en-DK"/>
+              </w:rPr>
+              <w:t xml:space="preserve"> </w:t>
+            </w:r>
+            <w:r>
+              <w:rPr>
+                <w:rFonts w:ascii="Cambria" w:hAnsi="Cambria" w:cs="Cambria"/>
+                <w:lang w:val="en-DK"/>
+              </w:rPr>
+              <w:t> </w:t>
+            </w:r>
+            <w:r>
+              <w:rPr>
+                <w:rFonts w:ascii="Segoe MDL2 Assets" w:hAnsi="Segoe MDL2 Assets" w:cs="Times New Roman"/>
+                <w:lang w:val="en-DK"/>
+              </w:rPr>
+              <w:t xml:space="preserve"> </w:t>
+            </w:r>
+            <w:r>
+              <w:rPr>
+                <w:rFonts w:ascii="Cambria" w:hAnsi="Cambria" w:cs="Cambria"/>
+                <w:lang w:val="en-DK"/>
+              </w:rPr>
+              <w:t> </w:t>
+            </w:r>
+            <w:r>
+              <w:rPr>
+                <w:rFonts w:ascii="Segoe MDL2 Assets" w:hAnsi="Segoe MDL2 Assets" w:cs="Times New Roman"/>
+                <w:lang w:val="en-DK"/>
+              </w:rPr>
+              <w:t xml:space="preserve"> </w:t>
+            </w:r>
+            <w:r>
+              <w:rPr>
+                <w:rFonts w:ascii="Cambria" w:hAnsi="Cambria" w:cs="Cambria"/>
+                <w:lang w:val="en-DK"/>
+              </w:rPr>
+              <w:t> </w:t>
+            </w:r>
+            <w:r>
+              <w:rPr>
+                <w:rFonts w:ascii="Segoe MDL2 Assets" w:hAnsi="Segoe MDL2 Assets" w:cs="Times New Roman"/>
+                <w:lang w:val="en-DK"/>
+              </w:rPr>
+              <w:t xml:space="preserve"> </w:t>
+            </w:r>
+            <w:r>
+              <w:rPr>
+                <w:rFonts w:ascii="Cambria" w:hAnsi="Cambria" w:cs="Cambria"/>
+                <w:lang w:val="en-DK"/>
+              </w:rPr>
+              <w:t> </w:t>
+            </w:r>
+            <w:r>
+              <w:rPr>
+                <w:rFonts w:ascii="Segoe MDL2 Assets" w:hAnsi="Segoe MDL2 Assets" w:cs="Times New Roman"/>
+                <w:lang w:val="en-DK"/>
+              </w:rPr>
+              <w:t xml:space="preserve"> </w:t>
+            </w:r>
+            <w:r>
+              <w:rPr>
+                <w:rFonts w:ascii="Cambria" w:hAnsi="Cambria" w:cs="Cambria"/>
+                <w:lang w:val="en-DK"/>
+              </w:rPr>
+              <w:t> </w:t>
+            </w:r>
+            <w:r>
+              <w:rPr>
+                <w:rFonts w:ascii="Segoe MDL2 Assets" w:hAnsi="Segoe MDL2 Assets" w:cs="Times New Roman"/>
+                <w:lang w:val="en-DK"/>
+              </w:rPr>
+              <w:t xml:space="preserve"> )</w:t>
+            </w:r>
+          </w:p>
+          <w:p/>
+        </w:tc>
+      </w:tr>
+    </w:tbl>
+    <w:p/>
+    <w:p>
       <w:pPr>
         <w:pStyle w:val="Heading1"/>
       </w:pPr>
       <w:r>
         <w:t>Rutediagrammer</w:t>
       </w:r>
-      <w:bookmarkEnd w:id="4"/>
+      <w:bookmarkEnd w:id="6"/>
     </w:p>
     <w:p>
       <w:r>
@@ -3524,6 +6905,22 @@
       <w:color w:val="666666"/>
     </w:rPr>
   </w:style>
+  <w:style w:type="table" w:styleId="TableGrid">
+    <w:name w:val="Table Grid"/>
+    <w:basedOn w:val="TableNormal"/>
+    <w:uiPriority w:val="39"/>
+    <w:rsid w:val="00FC003C"/>
+    <w:tblPr>
+      <w:tblBorders>
+        <w:top w:val="single" w:sz="4" w:space="0" w:color="auto"/>
+        <w:left w:val="single" w:sz="4" w:space="0" w:color="auto"/>
+        <w:bottom w:val="single" w:sz="4" w:space="0" w:color="auto"/>
+        <w:right w:val="single" w:sz="4" w:space="0" w:color="auto"/>
+        <w:insideH w:val="single" w:sz="4" w:space="0" w:color="auto"/>
+        <w:insideV w:val="single" w:sz="4" w:space="0" w:color="auto"/>
+      </w:tblBorders>
+    </w:tblPr>
+  </w:style>
 </w:styles>
 </file>
 
@@ -3632,6 +7029,20 @@
     <w:pitch w:val="variable"/>
     <w:sig w:usb0="E00006FF" w:usb1="420024FF" w:usb2="02000000" w:usb3="00000000" w:csb0="0000019F" w:csb1="00000000"/>
   </w:font>
+  <w:font w:name="Segoe MDL2 Assets">
+    <w:panose1 w:val="050A0102010101010101"/>
+    <w:charset w:val="00"/>
+    <w:family w:val="roman"/>
+    <w:pitch w:val="variable"/>
+    <w:sig w:usb0="00000003" w:usb1="10000000" w:usb2="00000000" w:usb3="00000000" w:csb0="00000001" w:csb1="00000000"/>
+  </w:font>
+  <w:font w:name="Cambria">
+    <w:panose1 w:val="02040503050406030204"/>
+    <w:charset w:val="00"/>
+    <w:family w:val="roman"/>
+    <w:pitch w:val="variable"/>
+    <w:sig w:usb0="E00006FF" w:usb1="420024FF" w:usb2="02000000" w:usb3="00000000" w:csb0="0000019F" w:csb1="00000000"/>
+  </w:font>
 </w:fonts>
 </file>
 
@@ -3653,12 +7064,15 @@
     <w:rsidRoot w:val="00560E4C"/>
     <w:rsid w:val="00014513"/>
     <w:rsid w:val="00036F8A"/>
+    <w:rsid w:val="001778C9"/>
     <w:rsid w:val="001F5ABE"/>
     <w:rsid w:val="00315E7B"/>
+    <w:rsid w:val="003F5806"/>
     <w:rsid w:val="00520D27"/>
     <w:rsid w:val="00560E4C"/>
     <w:rsid w:val="00631C0A"/>
     <w:rsid w:val="008A708E"/>
+    <w:rsid w:val="009369B8"/>
     <w:rsid w:val="00B50222"/>
     <w:rsid w:val="00C87345"/>
     <w:rsid w:val="00C976FA"/>
@@ -4112,39 +7526,13 @@
     <w:semiHidden/>
     <w:unhideWhenUsed/>
   </w:style>
-  <w:style w:type="paragraph" w:customStyle="1" w:styleId="4B7B645A0D41474EB3E7F35D2D5DB226">
-    <w:name w:val="4B7B645A0D41474EB3E7F35D2D5DB226"/>
-    <w:rsid w:val="00560E4C"/>
-  </w:style>
-  <w:style w:type="paragraph" w:customStyle="1" w:styleId="72E1E113910444DC909AA2C0C1855EE4">
-    <w:name w:val="72E1E113910444DC909AA2C0C1855EE4"/>
-    <w:rsid w:val="00560E4C"/>
-  </w:style>
-  <w:style w:type="paragraph" w:customStyle="1" w:styleId="B9FFA303B9B04A98ADB0F91F0BBBF435">
-    <w:name w:val="B9FFA303B9B04A98ADB0F91F0BBBF435"/>
-    <w:rsid w:val="00560E4C"/>
-  </w:style>
-  <w:style w:type="paragraph" w:customStyle="1" w:styleId="C519D2DF90B7433F9B6A6D48D089D72D">
-    <w:name w:val="C519D2DF90B7433F9B6A6D48D089D72D"/>
-    <w:rsid w:val="00560E4C"/>
-  </w:style>
-  <w:style w:type="paragraph" w:customStyle="1" w:styleId="EA0D34F7A340426B954FF80DC2CF29DC">
-    <w:name w:val="EA0D34F7A340426B954FF80DC2CF29DC"/>
-    <w:rsid w:val="00560E4C"/>
-  </w:style>
   <w:style w:type="paragraph" w:customStyle="1" w:styleId="79FD7EBCEA5C44F6851677FDDA11142E">
     <w:name w:val="79FD7EBCEA5C44F6851677FDDA11142E"/>
     <w:rsid w:val="00315E7B"/>
-    <w:rPr>
-      <w:lang w:val="en-DK" w:eastAsia="en-DK"/>
-    </w:rPr>
   </w:style>
   <w:style w:type="paragraph" w:customStyle="1" w:styleId="63351396900E4A44A96B21397ADA7E8C">
     <w:name w:val="63351396900E4A44A96B21397ADA7E8C"/>
     <w:rsid w:val="00315E7B"/>
-    <w:rPr>
-      <w:lang w:val="en-DK" w:eastAsia="en-DK"/>
-    </w:rPr>
   </w:style>
   <w:style w:type="character" w:styleId="PlaceholderText">
     <w:name w:val="Placeholder Text"/>

</xml_diff>